<commit_message>
Adding new prioritizing feature in documents
</commit_message>
<xml_diff>
--- a/Documents/TaskFlow_DocumentoDeArquitetura.docx
+++ b/Documents/TaskFlow_DocumentoDeArquitetura.docx
@@ -145,7 +145,7 @@
                 <w:sz w:val="19"/>
                 <w:szCs w:val="19"/>
               </w:rPr>
-              <w:t xml:space="preserve">2.0</w:t>
+              <w:t xml:space="preserve">2.1</w:t>
             </w:r>
           </w:p>
         </w:tc>
@@ -999,7 +999,7 @@
         <w:spacing w:before="60" w:after="60"/>
       </w:pPr>
       <w:r>
-        <w:t xml:space="preserve">A versão 2.0 (Setembro de 2026) registra três mudanças: a adoção de Clean Architecture no lugar da Layered Architecture; a substituição do Supabase por um backend próprio — a TaskFlow API, em NestJS com PostgreSQL, executada em Docker —; e a consolidação de todo o escopo em uma única entrega. O estado atual da implementação está detalhado na seção 9.</w:t>
+        <w:t xml:space="preserve">A versão 2.0 (Setembro de 2026) registra três mudanças: a adoção de Clean Architecture no lugar da Layered Architecture; a substituição do Supabase por um backend próprio — a TaskFlow API, em NestJS com PostgreSQL, executada em Docker —; e a consolidação de todo o escopo em uma única entrega. O estado atual da implementação está detalhado na seção 9. A versão 2.1 adiciona a feature de Priorização com IA (seção 5.10).</w:t>
       </w:r>
     </w:p>
     <w:p>
@@ -3756,6 +3756,190 @@
           </w:p>
         </w:tc>
       </w:tr>
+      <w:tr>
+        <w:tblPrEx>
+          <w:tblCellMar>
+            <w:top w:w="0" w:type="dxa"/>
+            <w:bottom w:w="0" w:type="dxa"/>
+          </w:tblCellMar>
+        </w:tblPrEx>
+        <w:tc>
+          <w:tcPr>
+            <w:tcW w:w="2200" w:type="dxa"/>
+            <w:tcBorders>
+              <w:top w:val="single" w:sz="4" w:space="0" w:color="AEC6D8"/>
+              <w:left w:val="single" w:sz="4" w:space="0" w:color="AEC6D8"/>
+              <w:bottom w:val="single" w:sz="4" w:space="0" w:color="AEC6D8"/>
+              <w:right w:val="single" w:sz="4" w:space="0" w:color="AEC6D8"/>
+            </w:tcBorders>
+            <w:shd w:val="clear" w:color="auto" w:fill="FFFFFF"/>
+            <w:tcMar>
+              <w:top w:w="70" w:type="dxa"/>
+              <w:left w:w="140" w:type="dxa"/>
+              <w:bottom w:w="70" w:type="dxa"/>
+              <w:right w:w="140" w:type="dxa"/>
+            </w:tcMar>
+            <w:vAlign w:val="center"/>
+          </w:tcPr>
+          <w:p>
+            <w:r>
+              <w:rPr>
+                <w:sz w:val="19"/>
+                <w:szCs w:val="19"/>
+              </w:rPr>
+              <w:t xml:space="preserve">PrioritizationScreen</w:t>
+            </w:r>
+          </w:p>
+        </w:tc>
+        <w:tc>
+          <w:tcPr>
+            <w:tcW w:w="1500" w:type="dxa"/>
+            <w:tcBorders>
+              <w:top w:val="single" w:sz="4" w:space="0" w:color="AEC6D8"/>
+              <w:left w:val="single" w:sz="4" w:space="0" w:color="AEC6D8"/>
+              <w:bottom w:val="single" w:sz="4" w:space="0" w:color="AEC6D8"/>
+              <w:right w:val="single" w:sz="4" w:space="0" w:color="AEC6D8"/>
+            </w:tcBorders>
+            <w:shd w:val="clear" w:color="auto" w:fill="FFFFFF"/>
+            <w:tcMar>
+              <w:top w:w="70" w:type="dxa"/>
+              <w:left w:w="140" w:type="dxa"/>
+              <w:bottom w:w="70" w:type="dxa"/>
+              <w:right w:w="140" w:type="dxa"/>
+            </w:tcMar>
+            <w:vAlign w:val="center"/>
+          </w:tcPr>
+          <w:p>
+            <w:r>
+              <w:rPr>
+                <w:sz w:val="19"/>
+                <w:szCs w:val="19"/>
+              </w:rPr>
+              <w:t xml:space="preserve">«component»</w:t>
+            </w:r>
+          </w:p>
+        </w:tc>
+        <w:tc>
+          <w:tcPr>
+            <w:tcW w:w="5660" w:type="dxa"/>
+            <w:tcBorders>
+              <w:top w:val="single" w:sz="4" w:space="0" w:color="AEC6D8"/>
+              <w:left w:val="single" w:sz="4" w:space="0" w:color="AEC6D8"/>
+              <w:bottom w:val="single" w:sz="4" w:space="0" w:color="AEC6D8"/>
+              <w:right w:val="single" w:sz="4" w:space="0" w:color="AEC6D8"/>
+            </w:tcBorders>
+            <w:shd w:val="clear" w:color="auto" w:fill="FFFFFF"/>
+            <w:tcMar>
+              <w:top w:w="70" w:type="dxa"/>
+              <w:left w:w="140" w:type="dxa"/>
+              <w:bottom w:w="70" w:type="dxa"/>
+              <w:right w:w="140" w:type="dxa"/>
+            </w:tcMar>
+            <w:vAlign w:val="center"/>
+          </w:tcPr>
+          <w:p>
+            <w:r>
+              <w:rPr>
+                <w:sz w:val="19"/>
+                <w:szCs w:val="19"/>
+              </w:rPr>
+              <w:t xml:space="preserve">Priorização com IA: cards em pilha com a sugestão da IA (quadrante, justificativa, confiança) e gestos → aceita, ← rejeita, ↑ Fazer agora.</w:t>
+            </w:r>
+          </w:p>
+        </w:tc>
+      </w:tr>
+      <w:tr>
+        <w:tblPrEx>
+          <w:tblCellMar>
+            <w:top w:w="0" w:type="dxa"/>
+            <w:bottom w:w="0" w:type="dxa"/>
+          </w:tblCellMar>
+        </w:tblPrEx>
+        <w:tc>
+          <w:tcPr>
+            <w:tcW w:w="2200" w:type="dxa"/>
+            <w:tcBorders>
+              <w:top w:val="single" w:sz="4" w:space="0" w:color="AEC6D8"/>
+              <w:left w:val="single" w:sz="4" w:space="0" w:color="AEC6D8"/>
+              <w:bottom w:val="single" w:sz="4" w:space="0" w:color="AEC6D8"/>
+              <w:right w:val="single" w:sz="4" w:space="0" w:color="AEC6D8"/>
+            </w:tcBorders>
+            <w:shd w:val="clear" w:color="auto" w:fill="FFFFFF"/>
+            <w:tcMar>
+              <w:top w:w="70" w:type="dxa"/>
+              <w:left w:w="140" w:type="dxa"/>
+              <w:bottom w:w="70" w:type="dxa"/>
+              <w:right w:w="140" w:type="dxa"/>
+            </w:tcMar>
+            <w:vAlign w:val="center"/>
+          </w:tcPr>
+          <w:p>
+            <w:r>
+              <w:rPr>
+                <w:sz w:val="19"/>
+                <w:szCs w:val="19"/>
+              </w:rPr>
+              <w:t xml:space="preserve">PrioritizationResultScreen</w:t>
+            </w:r>
+          </w:p>
+        </w:tc>
+        <w:tc>
+          <w:tcPr>
+            <w:tcW w:w="1500" w:type="dxa"/>
+            <w:tcBorders>
+              <w:top w:val="single" w:sz="4" w:space="0" w:color="AEC6D8"/>
+              <w:left w:val="single" w:sz="4" w:space="0" w:color="AEC6D8"/>
+              <w:bottom w:val="single" w:sz="4" w:space="0" w:color="AEC6D8"/>
+              <w:right w:val="single" w:sz="4" w:space="0" w:color="AEC6D8"/>
+            </w:tcBorders>
+            <w:shd w:val="clear" w:color="auto" w:fill="FFFFFF"/>
+            <w:tcMar>
+              <w:top w:w="70" w:type="dxa"/>
+              <w:left w:w="140" w:type="dxa"/>
+              <w:bottom w:w="70" w:type="dxa"/>
+              <w:right w:w="140" w:type="dxa"/>
+            </w:tcMar>
+            <w:vAlign w:val="center"/>
+          </w:tcPr>
+          <w:p>
+            <w:r>
+              <w:rPr>
+                <w:sz w:val="19"/>
+                <w:szCs w:val="19"/>
+              </w:rPr>
+              <w:t xml:space="preserve">«component»</w:t>
+            </w:r>
+          </w:p>
+        </w:tc>
+        <w:tc>
+          <w:tcPr>
+            <w:tcW w:w="5660" w:type="dxa"/>
+            <w:tcBorders>
+              <w:top w:val="single" w:sz="4" w:space="0" w:color="AEC6D8"/>
+              <w:left w:val="single" w:sz="4" w:space="0" w:color="AEC6D8"/>
+              <w:bottom w:val="single" w:sz="4" w:space="0" w:color="AEC6D8"/>
+              <w:right w:val="single" w:sz="4" w:space="0" w:color="AEC6D8"/>
+            </w:tcBorders>
+            <w:shd w:val="clear" w:color="auto" w:fill="FFFFFF"/>
+            <w:tcMar>
+              <w:top w:w="70" w:type="dxa"/>
+              <w:left w:w="140" w:type="dxa"/>
+              <w:bottom w:w="70" w:type="dxa"/>
+              <w:right w:w="140" w:type="dxa"/>
+            </w:tcMar>
+            <w:vAlign w:val="center"/>
+          </w:tcPr>
+          <w:p>
+            <w:r>
+              <w:rPr>
+                <w:sz w:val="19"/>
+                <w:szCs w:val="19"/>
+              </w:rPr>
+              <w:t xml:space="preserve">Matriz de Eisenhower 2×2 com o resultado da sessão; Aplicar, revisar e iniciar foco em "Fazer agora".</w:t>
+            </w:r>
+          </w:p>
+        </w:tc>
+      </w:tr>
     </w:tbl>
     <w:p>
       <w:pPr>
@@ -4280,6 +4464,98 @@
                 <w:szCs w:val="19"/>
               </w:rPr>
               <w:t xml:space="preserve">Status do sync (pendentes, último sync, offline) exibido no Perfil; chama SyncData.</w:t>
+            </w:r>
+          </w:p>
+        </w:tc>
+      </w:tr>
+      <w:tr>
+        <w:tblPrEx>
+          <w:tblCellMar>
+            <w:top w:w="0" w:type="dxa"/>
+            <w:bottom w:w="0" w:type="dxa"/>
+          </w:tblCellMar>
+        </w:tblPrEx>
+        <w:tc>
+          <w:tcPr>
+            <w:tcW w:w="2000" w:type="dxa"/>
+            <w:tcBorders>
+              <w:top w:val="single" w:sz="4" w:space="0" w:color="AEC6D8"/>
+              <w:left w:val="single" w:sz="4" w:space="0" w:color="AEC6D8"/>
+              <w:bottom w:val="single" w:sz="4" w:space="0" w:color="AEC6D8"/>
+              <w:right w:val="single" w:sz="4" w:space="0" w:color="AEC6D8"/>
+            </w:tcBorders>
+            <w:shd w:val="clear" w:color="auto" w:fill="EBF3FA"/>
+            <w:tcMar>
+              <w:top w:w="70" w:type="dxa"/>
+              <w:left w:w="140" w:type="dxa"/>
+              <w:bottom w:w="70" w:type="dxa"/>
+              <w:right w:w="140" w:type="dxa"/>
+            </w:tcMar>
+            <w:vAlign w:val="center"/>
+          </w:tcPr>
+          <w:p>
+            <w:r>
+              <w:rPr>
+                <w:sz w:val="19"/>
+                <w:szCs w:val="19"/>
+              </w:rPr>
+              <w:t xml:space="preserve">prioritizationStore</w:t>
+            </w:r>
+          </w:p>
+        </w:tc>
+        <w:tc>
+          <w:tcPr>
+            <w:tcW w:w="1600" w:type="dxa"/>
+            <w:tcBorders>
+              <w:top w:val="single" w:sz="4" w:space="0" w:color="AEC6D8"/>
+              <w:left w:val="single" w:sz="4" w:space="0" w:color="AEC6D8"/>
+              <w:bottom w:val="single" w:sz="4" w:space="0" w:color="AEC6D8"/>
+              <w:right w:val="single" w:sz="4" w:space="0" w:color="AEC6D8"/>
+            </w:tcBorders>
+            <w:shd w:val="clear" w:color="auto" w:fill="EBF3FA"/>
+            <w:tcMar>
+              <w:top w:w="70" w:type="dxa"/>
+              <w:left w:w="140" w:type="dxa"/>
+              <w:bottom w:w="70" w:type="dxa"/>
+              <w:right w:w="140" w:type="dxa"/>
+            </w:tcMar>
+            <w:vAlign w:val="center"/>
+          </w:tcPr>
+          <w:p>
+            <w:r>
+              <w:rPr>
+                <w:sz w:val="19"/>
+                <w:szCs w:val="19"/>
+              </w:rPr>
+              <w:t xml:space="preserve">Priorização</w:t>
+            </w:r>
+          </w:p>
+        </w:tc>
+        <w:tc>
+          <w:tcPr>
+            <w:tcW w:w="5760" w:type="dxa"/>
+            <w:tcBorders>
+              <w:top w:val="single" w:sz="4" w:space="0" w:color="AEC6D8"/>
+              <w:left w:val="single" w:sz="4" w:space="0" w:color="AEC6D8"/>
+              <w:bottom w:val="single" w:sz="4" w:space="0" w:color="AEC6D8"/>
+              <w:right w:val="single" w:sz="4" w:space="0" w:color="AEC6D8"/>
+            </w:tcBorders>
+            <w:shd w:val="clear" w:color="auto" w:fill="EBF3FA"/>
+            <w:tcMar>
+              <w:top w:w="70" w:type="dxa"/>
+              <w:left w:w="140" w:type="dxa"/>
+              <w:bottom w:w="70" w:type="dxa"/>
+              <w:right w:w="140" w:type="dxa"/>
+            </w:tcMar>
+            <w:vAlign w:val="center"/>
+          </w:tcPr>
+          <w:p>
+            <w:r>
+              <w:rPr>
+                <w:sz w:val="19"/>
+                <w:szCs w:val="19"/>
+              </w:rPr>
+              <w:t xml:space="preserve">Pilha de cards, decisões da sessão, estados (carregando, offline, erro) e resultado; chama StartPrioritization, DecideTask, UndoDecision e ApplyPrioritization.</w:t>
             </w:r>
           </w:p>
         </w:tc>
@@ -5364,6 +5640,282 @@
           </w:p>
         </w:tc>
       </w:tr>
+      <w:tr>
+        <w:tblPrEx>
+          <w:tblCellMar>
+            <w:top w:w="0" w:type="dxa"/>
+            <w:bottom w:w="0" w:type="dxa"/>
+          </w:tblCellMar>
+        </w:tblPrEx>
+        <w:tc>
+          <w:tcPr>
+            <w:tcW w:w="1800" w:type="dxa"/>
+            <w:tcBorders>
+              <w:top w:val="single" w:sz="4" w:space="0" w:color="AEC6D8"/>
+              <w:left w:val="single" w:sz="4" w:space="0" w:color="AEC6D8"/>
+              <w:bottom w:val="single" w:sz="4" w:space="0" w:color="AEC6D8"/>
+              <w:right w:val="single" w:sz="4" w:space="0" w:color="AEC6D8"/>
+            </w:tcBorders>
+            <w:shd w:val="clear" w:color="auto" w:fill="EBF3FA"/>
+            <w:tcMar>
+              <w:top w:w="70" w:type="dxa"/>
+              <w:left w:w="140" w:type="dxa"/>
+              <w:bottom w:w="70" w:type="dxa"/>
+              <w:right w:w="140" w:type="dxa"/>
+            </w:tcMar>
+            <w:vAlign w:val="center"/>
+          </w:tcPr>
+          <w:p>
+            <w:r>
+              <w:rPr>
+                <w:sz w:val="19"/>
+                <w:szCs w:val="19"/>
+              </w:rPr>
+              <w:t xml:space="preserve">StartPrioritization</w:t>
+            </w:r>
+          </w:p>
+        </w:tc>
+        <w:tc>
+          <w:tcPr>
+            <w:tcW w:w="2600" w:type="dxa"/>
+            <w:tcBorders>
+              <w:top w:val="single" w:sz="4" w:space="0" w:color="AEC6D8"/>
+              <w:left w:val="single" w:sz="4" w:space="0" w:color="AEC6D8"/>
+              <w:bottom w:val="single" w:sz="4" w:space="0" w:color="AEC6D8"/>
+              <w:right w:val="single" w:sz="4" w:space="0" w:color="AEC6D8"/>
+            </w:tcBorders>
+            <w:shd w:val="clear" w:color="auto" w:fill="EBF3FA"/>
+            <w:tcMar>
+              <w:top w:w="70" w:type="dxa"/>
+              <w:left w:w="140" w:type="dxa"/>
+              <w:bottom w:w="70" w:type="dxa"/>
+              <w:right w:w="140" w:type="dxa"/>
+            </w:tcMar>
+            <w:vAlign w:val="center"/>
+          </w:tcPr>
+          <w:p>
+            <w:r>
+              <w:rPr>
+                <w:sz w:val="19"/>
+                <w:szCs w:val="19"/>
+              </w:rPr>
+              <w:t xml:space="preserve">Priorização</w:t>
+            </w:r>
+          </w:p>
+        </w:tc>
+        <w:tc>
+          <w:tcPr>
+            <w:tcW w:w="4960" w:type="dxa"/>
+            <w:tcBorders>
+              <w:top w:val="single" w:sz="4" w:space="0" w:color="AEC6D8"/>
+              <w:left w:val="single" w:sz="4" w:space="0" w:color="AEC6D8"/>
+              <w:bottom w:val="single" w:sz="4" w:space="0" w:color="AEC6D8"/>
+              <w:right w:val="single" w:sz="4" w:space="0" w:color="AEC6D8"/>
+            </w:tcBorders>
+            <w:shd w:val="clear" w:color="auto" w:fill="EBF3FA"/>
+            <w:tcMar>
+              <w:top w:w="70" w:type="dxa"/>
+              <w:left w:w="140" w:type="dxa"/>
+              <w:bottom w:w="70" w:type="dxa"/>
+              <w:right w:w="140" w:type="dxa"/>
+            </w:tcMar>
+            <w:vAlign w:val="center"/>
+          </w:tcPr>
+          <w:p>
+            <w:r>
+              <w:rPr>
+                <w:sz w:val="19"/>
+                <w:szCs w:val="19"/>
+              </w:rPr>
+              <w:t xml:space="preserve">Verifica conexão (RN-14), sincroniza pendências e abre a sessão na API com as tarefas pendentes (RF-34, RF-35).</w:t>
+            </w:r>
+          </w:p>
+        </w:tc>
+      </w:tr>
+      <w:tr>
+        <w:tblPrEx>
+          <w:tblCellMar>
+            <w:top w:w="0" w:type="dxa"/>
+            <w:bottom w:w="0" w:type="dxa"/>
+          </w:tblCellMar>
+        </w:tblPrEx>
+        <w:tc>
+          <w:tcPr>
+            <w:tcW w:w="1800" w:type="dxa"/>
+            <w:tcBorders>
+              <w:top w:val="single" w:sz="4" w:space="0" w:color="AEC6D8"/>
+              <w:left w:val="single" w:sz="4" w:space="0" w:color="AEC6D8"/>
+              <w:bottom w:val="single" w:sz="4" w:space="0" w:color="AEC6D8"/>
+              <w:right w:val="single" w:sz="4" w:space="0" w:color="AEC6D8"/>
+            </w:tcBorders>
+            <w:shd w:val="clear" w:color="auto" w:fill="EBF3FA"/>
+            <w:tcMar>
+              <w:top w:w="70" w:type="dxa"/>
+              <w:left w:w="140" w:type="dxa"/>
+              <w:bottom w:w="70" w:type="dxa"/>
+              <w:right w:w="140" w:type="dxa"/>
+            </w:tcMar>
+            <w:vAlign w:val="center"/>
+          </w:tcPr>
+          <w:p>
+            <w:r>
+              <w:rPr>
+                <w:sz w:val="19"/>
+                <w:szCs w:val="19"/>
+              </w:rPr>
+              <w:t xml:space="preserve">DecideTask / UndoDecision</w:t>
+            </w:r>
+          </w:p>
+        </w:tc>
+        <w:tc>
+          <w:tcPr>
+            <w:tcW w:w="2600" w:type="dxa"/>
+            <w:tcBorders>
+              <w:top w:val="single" w:sz="4" w:space="0" w:color="AEC6D8"/>
+              <w:left w:val="single" w:sz="4" w:space="0" w:color="AEC6D8"/>
+              <w:bottom w:val="single" w:sz="4" w:space="0" w:color="AEC6D8"/>
+              <w:right w:val="single" w:sz="4" w:space="0" w:color="AEC6D8"/>
+            </w:tcBorders>
+            <w:shd w:val="clear" w:color="auto" w:fill="EBF3FA"/>
+            <w:tcMar>
+              <w:top w:w="70" w:type="dxa"/>
+              <w:left w:w="140" w:type="dxa"/>
+              <w:bottom w:w="70" w:type="dxa"/>
+              <w:right w:w="140" w:type="dxa"/>
+            </w:tcMar>
+            <w:vAlign w:val="center"/>
+          </w:tcPr>
+          <w:p>
+            <w:r>
+              <w:rPr>
+                <w:sz w:val="19"/>
+                <w:szCs w:val="19"/>
+              </w:rPr>
+              <w:t xml:space="preserve">Priorização</w:t>
+            </w:r>
+          </w:p>
+        </w:tc>
+        <w:tc>
+          <w:tcPr>
+            <w:tcW w:w="4960" w:type="dxa"/>
+            <w:tcBorders>
+              <w:top w:val="single" w:sz="4" w:space="0" w:color="AEC6D8"/>
+              <w:left w:val="single" w:sz="4" w:space="0" w:color="AEC6D8"/>
+              <w:bottom w:val="single" w:sz="4" w:space="0" w:color="AEC6D8"/>
+              <w:right w:val="single" w:sz="4" w:space="0" w:color="AEC6D8"/>
+            </w:tcBorders>
+            <w:shd w:val="clear" w:color="auto" w:fill="EBF3FA"/>
+            <w:tcMar>
+              <w:top w:w="70" w:type="dxa"/>
+              <w:left w:w="140" w:type="dxa"/>
+              <w:bottom w:w="70" w:type="dxa"/>
+              <w:right w:w="140" w:type="dxa"/>
+            </w:tcMar>
+            <w:vAlign w:val="center"/>
+          </w:tcPr>
+          <w:p>
+            <w:r>
+              <w:rPr>
+                <w:sz w:val="19"/>
+                <w:szCs w:val="19"/>
+              </w:rPr>
+              <w:t xml:space="preserve">Registra aceitar/rejeitar/urgente e recebe as sugestões ajustadas (RF-36, RF-37).</w:t>
+            </w:r>
+          </w:p>
+        </w:tc>
+      </w:tr>
+      <w:tr>
+        <w:tblPrEx>
+          <w:tblCellMar>
+            <w:top w:w="0" w:type="dxa"/>
+            <w:bottom w:w="0" w:type="dxa"/>
+          </w:tblCellMar>
+        </w:tblPrEx>
+        <w:tc>
+          <w:tcPr>
+            <w:tcW w:w="1800" w:type="dxa"/>
+            <w:tcBorders>
+              <w:top w:val="single" w:sz="4" w:space="0" w:color="AEC6D8"/>
+              <w:left w:val="single" w:sz="4" w:space="0" w:color="AEC6D8"/>
+              <w:bottom w:val="single" w:sz="4" w:space="0" w:color="AEC6D8"/>
+              <w:right w:val="single" w:sz="4" w:space="0" w:color="AEC6D8"/>
+            </w:tcBorders>
+            <w:shd w:val="clear" w:color="auto" w:fill="EBF3FA"/>
+            <w:tcMar>
+              <w:top w:w="70" w:type="dxa"/>
+              <w:left w:w="140" w:type="dxa"/>
+              <w:bottom w:w="70" w:type="dxa"/>
+              <w:right w:w="140" w:type="dxa"/>
+            </w:tcMar>
+            <w:vAlign w:val="center"/>
+          </w:tcPr>
+          <w:p>
+            <w:r>
+              <w:rPr>
+                <w:sz w:val="19"/>
+                <w:szCs w:val="19"/>
+              </w:rPr>
+              <w:t xml:space="preserve">ApplyPrioritization</w:t>
+            </w:r>
+          </w:p>
+        </w:tc>
+        <w:tc>
+          <w:tcPr>
+            <w:tcW w:w="2600" w:type="dxa"/>
+            <w:tcBorders>
+              <w:top w:val="single" w:sz="4" w:space="0" w:color="AEC6D8"/>
+              <w:left w:val="single" w:sz="4" w:space="0" w:color="AEC6D8"/>
+              <w:bottom w:val="single" w:sz="4" w:space="0" w:color="AEC6D8"/>
+              <w:right w:val="single" w:sz="4" w:space="0" w:color="AEC6D8"/>
+            </w:tcBorders>
+            <w:shd w:val="clear" w:color="auto" w:fill="EBF3FA"/>
+            <w:tcMar>
+              <w:top w:w="70" w:type="dxa"/>
+              <w:left w:w="140" w:type="dxa"/>
+              <w:bottom w:w="70" w:type="dxa"/>
+              <w:right w:w="140" w:type="dxa"/>
+            </w:tcMar>
+            <w:vAlign w:val="center"/>
+          </w:tcPr>
+          <w:p>
+            <w:r>
+              <w:rPr>
+                <w:sz w:val="19"/>
+                <w:szCs w:val="19"/>
+              </w:rPr>
+              <w:t xml:space="preserve">Priorização</w:t>
+            </w:r>
+          </w:p>
+        </w:tc>
+        <w:tc>
+          <w:tcPr>
+            <w:tcW w:w="4960" w:type="dxa"/>
+            <w:tcBorders>
+              <w:top w:val="single" w:sz="4" w:space="0" w:color="AEC6D8"/>
+              <w:left w:val="single" w:sz="4" w:space="0" w:color="AEC6D8"/>
+              <w:bottom w:val="single" w:sz="4" w:space="0" w:color="AEC6D8"/>
+              <w:right w:val="single" w:sz="4" w:space="0" w:color="AEC6D8"/>
+            </w:tcBorders>
+            <w:shd w:val="clear" w:color="auto" w:fill="EBF3FA"/>
+            <w:tcMar>
+              <w:top w:w="70" w:type="dxa"/>
+              <w:left w:w="140" w:type="dxa"/>
+              <w:bottom w:w="70" w:type="dxa"/>
+              <w:right w:w="140" w:type="dxa"/>
+            </w:tcMar>
+            <w:vAlign w:val="center"/>
+          </w:tcPr>
+          <w:p>
+            <w:r>
+              <w:rPr>
+                <w:sz w:val="19"/>
+                <w:szCs w:val="19"/>
+              </w:rPr>
+              <w:t xml:space="preserve">Aplica quadrante e prioridade conforme RN-12, só após confirmação (RN-13, RF-38).</w:t>
+            </w:r>
+          </w:p>
+        </w:tc>
+      </w:tr>
     </w:tbl>
     <w:p>
       <w:pPr>
@@ -5975,6 +6527,190 @@
                 <w:szCs w:val="19"/>
               </w:rPr>
               <w:t xml:space="preserve">Tempo, geração de uuid, notificações, armazenamento seguro e estado da rede.</w:t>
+            </w:r>
+          </w:p>
+        </w:tc>
+      </w:tr>
+      <w:tr>
+        <w:tblPrEx>
+          <w:tblCellMar>
+            <w:top w:w="0" w:type="dxa"/>
+            <w:bottom w:w="0" w:type="dxa"/>
+          </w:tblCellMar>
+        </w:tblPrEx>
+        <w:tc>
+          <w:tcPr>
+            <w:tcW w:w="1800" w:type="dxa"/>
+            <w:tcBorders>
+              <w:top w:val="single" w:sz="4" w:space="0" w:color="AEC6D8"/>
+              <w:left w:val="single" w:sz="4" w:space="0" w:color="AEC6D8"/>
+              <w:bottom w:val="single" w:sz="4" w:space="0" w:color="AEC6D8"/>
+              <w:right w:val="single" w:sz="4" w:space="0" w:color="AEC6D8"/>
+            </w:tcBorders>
+            <w:shd w:val="clear" w:color="auto" w:fill="FFFFFF"/>
+            <w:tcMar>
+              <w:top w:w="70" w:type="dxa"/>
+              <w:left w:w="140" w:type="dxa"/>
+              <w:bottom w:w="70" w:type="dxa"/>
+              <w:right w:w="140" w:type="dxa"/>
+            </w:tcMar>
+            <w:vAlign w:val="center"/>
+          </w:tcPr>
+          <w:p>
+            <w:r>
+              <w:rPr>
+                <w:sz w:val="19"/>
+                <w:szCs w:val="19"/>
+              </w:rPr>
+              <w:t xml:space="preserve">Quadrant, PrioritizationSession, PrioritizationDecision</w:t>
+            </w:r>
+          </w:p>
+        </w:tc>
+        <w:tc>
+          <w:tcPr>
+            <w:tcW w:w="2600" w:type="dxa"/>
+            <w:tcBorders>
+              <w:top w:val="single" w:sz="4" w:space="0" w:color="AEC6D8"/>
+              <w:left w:val="single" w:sz="4" w:space="0" w:color="AEC6D8"/>
+              <w:bottom w:val="single" w:sz="4" w:space="0" w:color="AEC6D8"/>
+              <w:right w:val="single" w:sz="4" w:space="0" w:color="AEC6D8"/>
+            </w:tcBorders>
+            <w:shd w:val="clear" w:color="auto" w:fill="FFFFFF"/>
+            <w:tcMar>
+              <w:top w:w="70" w:type="dxa"/>
+              <w:left w:w="140" w:type="dxa"/>
+              <w:bottom w:w="70" w:type="dxa"/>
+              <w:right w:w="140" w:type="dxa"/>
+            </w:tcMar>
+            <w:vAlign w:val="center"/>
+          </w:tcPr>
+          <w:p>
+            <w:r>
+              <w:rPr>
+                <w:sz w:val="19"/>
+                <w:szCs w:val="19"/>
+              </w:rPr>
+              <w:t xml:space="preserve">Entidades / value object</w:t>
+            </w:r>
+          </w:p>
+        </w:tc>
+        <w:tc>
+          <w:tcPr>
+            <w:tcW w:w="4960" w:type="dxa"/>
+            <w:tcBorders>
+              <w:top w:val="single" w:sz="4" w:space="0" w:color="AEC6D8"/>
+              <w:left w:val="single" w:sz="4" w:space="0" w:color="AEC6D8"/>
+              <w:bottom w:val="single" w:sz="4" w:space="0" w:color="AEC6D8"/>
+              <w:right w:val="single" w:sz="4" w:space="0" w:color="AEC6D8"/>
+            </w:tcBorders>
+            <w:shd w:val="clear" w:color="auto" w:fill="FFFFFF"/>
+            <w:tcMar>
+              <w:top w:w="70" w:type="dxa"/>
+              <w:left w:w="140" w:type="dxa"/>
+              <w:bottom w:w="70" w:type="dxa"/>
+              <w:right w:w="140" w:type="dxa"/>
+            </w:tcMar>
+            <w:vAlign w:val="center"/>
+          </w:tcPr>
+          <w:p>
+            <w:r>
+              <w:rPr>
+                <w:sz w:val="19"/>
+                <w:szCs w:val="19"/>
+              </w:rPr>
+              <w:t xml:space="preserve">Quadrantes de Eisenhower, sessão de priorização e cada decisão (sugestão da IA × escolha do usuário).</w:t>
+            </w:r>
+          </w:p>
+        </w:tc>
+      </w:tr>
+      <w:tr>
+        <w:tblPrEx>
+          <w:tblCellMar>
+            <w:top w:w="0" w:type="dxa"/>
+            <w:bottom w:w="0" w:type="dxa"/>
+          </w:tblCellMar>
+        </w:tblPrEx>
+        <w:tc>
+          <w:tcPr>
+            <w:tcW w:w="1800" w:type="dxa"/>
+            <w:tcBorders>
+              <w:top w:val="single" w:sz="4" w:space="0" w:color="AEC6D8"/>
+              <w:left w:val="single" w:sz="4" w:space="0" w:color="AEC6D8"/>
+              <w:bottom w:val="single" w:sz="4" w:space="0" w:color="AEC6D8"/>
+              <w:right w:val="single" w:sz="4" w:space="0" w:color="AEC6D8"/>
+            </w:tcBorders>
+            <w:shd w:val="clear" w:color="auto" w:fill="FFFFFF"/>
+            <w:tcMar>
+              <w:top w:w="70" w:type="dxa"/>
+              <w:left w:w="140" w:type="dxa"/>
+              <w:bottom w:w="70" w:type="dxa"/>
+              <w:right w:w="140" w:type="dxa"/>
+            </w:tcMar>
+            <w:vAlign w:val="center"/>
+          </w:tcPr>
+          <w:p>
+            <w:r>
+              <w:rPr>
+                <w:sz w:val="19"/>
+                <w:szCs w:val="19"/>
+              </w:rPr>
+              <w:t xml:space="preserve">PrioritizationGateway</w:t>
+            </w:r>
+          </w:p>
+        </w:tc>
+        <w:tc>
+          <w:tcPr>
+            <w:tcW w:w="2600" w:type="dxa"/>
+            <w:tcBorders>
+              <w:top w:val="single" w:sz="4" w:space="0" w:color="AEC6D8"/>
+              <w:left w:val="single" w:sz="4" w:space="0" w:color="AEC6D8"/>
+              <w:bottom w:val="single" w:sz="4" w:space="0" w:color="AEC6D8"/>
+              <w:right w:val="single" w:sz="4" w:space="0" w:color="AEC6D8"/>
+            </w:tcBorders>
+            <w:shd w:val="clear" w:color="auto" w:fill="FFFFFF"/>
+            <w:tcMar>
+              <w:top w:w="70" w:type="dxa"/>
+              <w:left w:w="140" w:type="dxa"/>
+              <w:bottom w:w="70" w:type="dxa"/>
+              <w:right w:w="140" w:type="dxa"/>
+            </w:tcMar>
+            <w:vAlign w:val="center"/>
+          </w:tcPr>
+          <w:p>
+            <w:r>
+              <w:rPr>
+                <w:sz w:val="19"/>
+                <w:szCs w:val="19"/>
+              </w:rPr>
+              <w:t xml:space="preserve">Porta (serviço remoto)</w:t>
+            </w:r>
+          </w:p>
+        </w:tc>
+        <w:tc>
+          <w:tcPr>
+            <w:tcW w:w="4960" w:type="dxa"/>
+            <w:tcBorders>
+              <w:top w:val="single" w:sz="4" w:space="0" w:color="AEC6D8"/>
+              <w:left w:val="single" w:sz="4" w:space="0" w:color="AEC6D8"/>
+              <w:bottom w:val="single" w:sz="4" w:space="0" w:color="AEC6D8"/>
+              <w:right w:val="single" w:sz="4" w:space="0" w:color="AEC6D8"/>
+            </w:tcBorders>
+            <w:shd w:val="clear" w:color="auto" w:fill="FFFFFF"/>
+            <w:tcMar>
+              <w:top w:w="70" w:type="dxa"/>
+              <w:left w:w="140" w:type="dxa"/>
+              <w:bottom w:w="70" w:type="dxa"/>
+              <w:right w:w="140" w:type="dxa"/>
+            </w:tcMar>
+            <w:vAlign w:val="center"/>
+          </w:tcPr>
+          <w:p>
+            <w:r>
+              <w:rPr>
+                <w:sz w:val="19"/>
+                <w:szCs w:val="19"/>
+              </w:rPr>
+              <w:t xml:space="preserve">No app: comunicação com os endpoints de priorização da API.</w:t>
             </w:r>
           </w:p>
         </w:tc>
@@ -6682,6 +7418,98 @@
                 <w:szCs w:val="19"/>
               </w:rPr>
               <w:t xml:space="preserve">Feedback tátil e sons (Perfil → configurações)</w:t>
+            </w:r>
+          </w:p>
+        </w:tc>
+      </w:tr>
+      <w:tr>
+        <w:tblPrEx>
+          <w:tblCellMar>
+            <w:top w:w="0" w:type="dxa"/>
+            <w:bottom w:w="0" w:type="dxa"/>
+          </w:tblCellMar>
+        </w:tblPrEx>
+        <w:tc>
+          <w:tcPr>
+            <w:tcW w:w="2400" w:type="dxa"/>
+            <w:tcBorders>
+              <w:top w:val="single" w:sz="4" w:space="0" w:color="AEC6D8"/>
+              <w:left w:val="single" w:sz="4" w:space="0" w:color="AEC6D8"/>
+              <w:bottom w:val="single" w:sz="4" w:space="0" w:color="AEC6D8"/>
+              <w:right w:val="single" w:sz="4" w:space="0" w:color="AEC6D8"/>
+            </w:tcBorders>
+            <w:shd w:val="clear" w:color="auto" w:fill="EBF3FA"/>
+            <w:tcMar>
+              <w:top w:w="70" w:type="dxa"/>
+              <w:left w:w="140" w:type="dxa"/>
+              <w:bottom w:w="70" w:type="dxa"/>
+              <w:right w:w="140" w:type="dxa"/>
+            </w:tcMar>
+            <w:vAlign w:val="center"/>
+          </w:tcPr>
+          <w:p>
+            <w:r>
+              <w:rPr>
+                <w:sz w:val="19"/>
+                <w:szCs w:val="19"/>
+              </w:rPr>
+              <w:t xml:space="preserve">HttpPrioritizationGateway</w:t>
+            </w:r>
+          </w:p>
+        </w:tc>
+        <w:tc>
+          <w:tcPr>
+            <w:tcW w:w="1600" w:type="dxa"/>
+            <w:tcBorders>
+              <w:top w:val="single" w:sz="4" w:space="0" w:color="AEC6D8"/>
+              <w:left w:val="single" w:sz="4" w:space="0" w:color="AEC6D8"/>
+              <w:bottom w:val="single" w:sz="4" w:space="0" w:color="AEC6D8"/>
+              <w:right w:val="single" w:sz="4" w:space="0" w:color="AEC6D8"/>
+            </w:tcBorders>
+            <w:shd w:val="clear" w:color="auto" w:fill="EBF3FA"/>
+            <w:tcMar>
+              <w:top w:w="70" w:type="dxa"/>
+              <w:left w:w="140" w:type="dxa"/>
+              <w:bottom w:w="70" w:type="dxa"/>
+              <w:right w:w="140" w:type="dxa"/>
+            </w:tcMar>
+            <w:vAlign w:val="center"/>
+          </w:tcPr>
+          <w:p>
+            <w:r>
+              <w:rPr>
+                <w:sz w:val="19"/>
+                <w:szCs w:val="19"/>
+              </w:rPr>
+              <w:t xml:space="preserve">fetch + JWT (TaskFlow API)</w:t>
+            </w:r>
+          </w:p>
+        </w:tc>
+        <w:tc>
+          <w:tcPr>
+            <w:tcW w:w="5360" w:type="dxa"/>
+            <w:tcBorders>
+              <w:top w:val="single" w:sz="4" w:space="0" w:color="AEC6D8"/>
+              <w:left w:val="single" w:sz="4" w:space="0" w:color="AEC6D8"/>
+              <w:bottom w:val="single" w:sz="4" w:space="0" w:color="AEC6D8"/>
+              <w:right w:val="single" w:sz="4" w:space="0" w:color="AEC6D8"/>
+            </w:tcBorders>
+            <w:shd w:val="clear" w:color="auto" w:fill="EBF3FA"/>
+            <w:tcMar>
+              <w:top w:w="70" w:type="dxa"/>
+              <w:left w:w="140" w:type="dxa"/>
+              <w:bottom w:w="70" w:type="dxa"/>
+              <w:right w:w="140" w:type="dxa"/>
+            </w:tcMar>
+            <w:vAlign w:val="center"/>
+          </w:tcPr>
+          <w:p>
+            <w:r>
+              <w:rPr>
+                <w:sz w:val="19"/>
+                <w:szCs w:val="19"/>
+              </w:rPr>
+              <w:t xml:space="preserve">PrioritizationGateway</w:t>
             </w:r>
           </w:p>
         </w:tc>
@@ -8376,6 +9204,282 @@
           </w:p>
         </w:tc>
       </w:tr>
+      <w:tr>
+        <w:tblPrEx>
+          <w:tblCellMar>
+            <w:top w:w="0" w:type="dxa"/>
+            <w:bottom w:w="0" w:type="dxa"/>
+          </w:tblCellMar>
+        </w:tblPrEx>
+        <w:tc>
+          <w:tcPr>
+            <w:tcW w:w="2200" w:type="dxa"/>
+            <w:tcBorders>
+              <w:top w:val="single" w:sz="4" w:space="0" w:color="AEC6D8"/>
+              <w:left w:val="single" w:sz="4" w:space="0" w:color="AEC6D8"/>
+              <w:bottom w:val="single" w:sz="4" w:space="0" w:color="AEC6D8"/>
+              <w:right w:val="single" w:sz="4" w:space="0" w:color="AEC6D8"/>
+            </w:tcBorders>
+            <w:shd w:val="clear" w:color="auto" w:fill="FFFFFF"/>
+            <w:tcMar>
+              <w:top w:w="70" w:type="dxa"/>
+              <w:left w:w="140" w:type="dxa"/>
+              <w:bottom w:w="70" w:type="dxa"/>
+              <w:right w:w="140" w:type="dxa"/>
+            </w:tcMar>
+            <w:vAlign w:val="center"/>
+          </w:tcPr>
+          <w:p>
+            <w:r>
+              <w:rPr>
+                <w:sz w:val="19"/>
+                <w:szCs w:val="19"/>
+              </w:rPr>
+              <w:t xml:space="preserve">/prioritization/sessions</w:t>
+            </w:r>
+          </w:p>
+        </w:tc>
+        <w:tc>
+          <w:tcPr>
+            <w:tcW w:w="2400" w:type="dxa"/>
+            <w:tcBorders>
+              <w:top w:val="single" w:sz="4" w:space="0" w:color="AEC6D8"/>
+              <w:left w:val="single" w:sz="4" w:space="0" w:color="AEC6D8"/>
+              <w:bottom w:val="single" w:sz="4" w:space="0" w:color="AEC6D8"/>
+              <w:right w:val="single" w:sz="4" w:space="0" w:color="AEC6D8"/>
+            </w:tcBorders>
+            <w:shd w:val="clear" w:color="auto" w:fill="FFFFFF"/>
+            <w:tcMar>
+              <w:top w:w="70" w:type="dxa"/>
+              <w:left w:w="140" w:type="dxa"/>
+              <w:bottom w:w="70" w:type="dxa"/>
+              <w:right w:w="140" w:type="dxa"/>
+            </w:tcMar>
+            <w:vAlign w:val="center"/>
+          </w:tcPr>
+          <w:p>
+            <w:r>
+              <w:rPr>
+                <w:sz w:val="19"/>
+                <w:szCs w:val="19"/>
+              </w:rPr>
+              <w:t xml:space="preserve">POST</w:t>
+            </w:r>
+          </w:p>
+        </w:tc>
+        <w:tc>
+          <w:tcPr>
+            <w:tcW w:w="4760" w:type="dxa"/>
+            <w:tcBorders>
+              <w:top w:val="single" w:sz="4" w:space="0" w:color="AEC6D8"/>
+              <w:left w:val="single" w:sz="4" w:space="0" w:color="AEC6D8"/>
+              <w:bottom w:val="single" w:sz="4" w:space="0" w:color="AEC6D8"/>
+              <w:right w:val="single" w:sz="4" w:space="0" w:color="AEC6D8"/>
+            </w:tcBorders>
+            <w:shd w:val="clear" w:color="auto" w:fill="FFFFFF"/>
+            <w:tcMar>
+              <w:top w:w="70" w:type="dxa"/>
+              <w:left w:w="140" w:type="dxa"/>
+              <w:bottom w:w="70" w:type="dxa"/>
+              <w:right w:w="140" w:type="dxa"/>
+            </w:tcMar>
+            <w:vAlign w:val="center"/>
+          </w:tcPr>
+          <w:p>
+            <w:r>
+              <w:rPr>
+                <w:sz w:val="19"/>
+                <w:szCs w:val="19"/>
+              </w:rPr>
+              <w:t xml:space="preserve">Abre uma sessão com as tarefas pendentes e retorna as sugestões da IA.</w:t>
+            </w:r>
+          </w:p>
+        </w:tc>
+      </w:tr>
+      <w:tr>
+        <w:tblPrEx>
+          <w:tblCellMar>
+            <w:top w:w="0" w:type="dxa"/>
+            <w:bottom w:w="0" w:type="dxa"/>
+          </w:tblCellMar>
+        </w:tblPrEx>
+        <w:tc>
+          <w:tcPr>
+            <w:tcW w:w="2200" w:type="dxa"/>
+            <w:tcBorders>
+              <w:top w:val="single" w:sz="4" w:space="0" w:color="AEC6D8"/>
+              <w:left w:val="single" w:sz="4" w:space="0" w:color="AEC6D8"/>
+              <w:bottom w:val="single" w:sz="4" w:space="0" w:color="AEC6D8"/>
+              <w:right w:val="single" w:sz="4" w:space="0" w:color="AEC6D8"/>
+            </w:tcBorders>
+            <w:shd w:val="clear" w:color="auto" w:fill="FFFFFF"/>
+            <w:tcMar>
+              <w:top w:w="70" w:type="dxa"/>
+              <w:left w:w="140" w:type="dxa"/>
+              <w:bottom w:w="70" w:type="dxa"/>
+              <w:right w:w="140" w:type="dxa"/>
+            </w:tcMar>
+            <w:vAlign w:val="center"/>
+          </w:tcPr>
+          <w:p>
+            <w:r>
+              <w:rPr>
+                <w:sz w:val="19"/>
+                <w:szCs w:val="19"/>
+              </w:rPr>
+              <w:t xml:space="preserve">/prioritization/sessions/:id/decisions</w:t>
+            </w:r>
+          </w:p>
+        </w:tc>
+        <w:tc>
+          <w:tcPr>
+            <w:tcW w:w="2400" w:type="dxa"/>
+            <w:tcBorders>
+              <w:top w:val="single" w:sz="4" w:space="0" w:color="AEC6D8"/>
+              <w:left w:val="single" w:sz="4" w:space="0" w:color="AEC6D8"/>
+              <w:bottom w:val="single" w:sz="4" w:space="0" w:color="AEC6D8"/>
+              <w:right w:val="single" w:sz="4" w:space="0" w:color="AEC6D8"/>
+            </w:tcBorders>
+            <w:shd w:val="clear" w:color="auto" w:fill="FFFFFF"/>
+            <w:tcMar>
+              <w:top w:w="70" w:type="dxa"/>
+              <w:left w:w="140" w:type="dxa"/>
+              <w:bottom w:w="70" w:type="dxa"/>
+              <w:right w:w="140" w:type="dxa"/>
+            </w:tcMar>
+            <w:vAlign w:val="center"/>
+          </w:tcPr>
+          <w:p>
+            <w:r>
+              <w:rPr>
+                <w:sz w:val="19"/>
+                <w:szCs w:val="19"/>
+              </w:rPr>
+              <w:t xml:space="preserve">POST, DELETE</w:t>
+            </w:r>
+          </w:p>
+        </w:tc>
+        <w:tc>
+          <w:tcPr>
+            <w:tcW w:w="4760" w:type="dxa"/>
+            <w:tcBorders>
+              <w:top w:val="single" w:sz="4" w:space="0" w:color="AEC6D8"/>
+              <w:left w:val="single" w:sz="4" w:space="0" w:color="AEC6D8"/>
+              <w:bottom w:val="single" w:sz="4" w:space="0" w:color="AEC6D8"/>
+              <w:right w:val="single" w:sz="4" w:space="0" w:color="AEC6D8"/>
+            </w:tcBorders>
+            <w:shd w:val="clear" w:color="auto" w:fill="FFFFFF"/>
+            <w:tcMar>
+              <w:top w:w="70" w:type="dxa"/>
+              <w:left w:w="140" w:type="dxa"/>
+              <w:bottom w:w="70" w:type="dxa"/>
+              <w:right w:w="140" w:type="dxa"/>
+            </w:tcMar>
+            <w:vAlign w:val="center"/>
+          </w:tcPr>
+          <w:p>
+            <w:r>
+              <w:rPr>
+                <w:sz w:val="19"/>
+                <w:szCs w:val="19"/>
+              </w:rPr>
+              <w:t xml:space="preserve">Registra (ou desfaz) uma decisão e retorna as sugestões restantes ajustadas.</w:t>
+            </w:r>
+          </w:p>
+        </w:tc>
+      </w:tr>
+      <w:tr>
+        <w:tblPrEx>
+          <w:tblCellMar>
+            <w:top w:w="0" w:type="dxa"/>
+            <w:bottom w:w="0" w:type="dxa"/>
+          </w:tblCellMar>
+        </w:tblPrEx>
+        <w:tc>
+          <w:tcPr>
+            <w:tcW w:w="2200" w:type="dxa"/>
+            <w:tcBorders>
+              <w:top w:val="single" w:sz="4" w:space="0" w:color="AEC6D8"/>
+              <w:left w:val="single" w:sz="4" w:space="0" w:color="AEC6D8"/>
+              <w:bottom w:val="single" w:sz="4" w:space="0" w:color="AEC6D8"/>
+              <w:right w:val="single" w:sz="4" w:space="0" w:color="AEC6D8"/>
+            </w:tcBorders>
+            <w:shd w:val="clear" w:color="auto" w:fill="FFFFFF"/>
+            <w:tcMar>
+              <w:top w:w="70" w:type="dxa"/>
+              <w:left w:w="140" w:type="dxa"/>
+              <w:bottom w:w="70" w:type="dxa"/>
+              <w:right w:w="140" w:type="dxa"/>
+            </w:tcMar>
+            <w:vAlign w:val="center"/>
+          </w:tcPr>
+          <w:p>
+            <w:r>
+              <w:rPr>
+                <w:sz w:val="19"/>
+                <w:szCs w:val="19"/>
+              </w:rPr>
+              <w:t xml:space="preserve">/prioritization/sessions/:id/apply</w:t>
+            </w:r>
+          </w:p>
+        </w:tc>
+        <w:tc>
+          <w:tcPr>
+            <w:tcW w:w="2400" w:type="dxa"/>
+            <w:tcBorders>
+              <w:top w:val="single" w:sz="4" w:space="0" w:color="AEC6D8"/>
+              <w:left w:val="single" w:sz="4" w:space="0" w:color="AEC6D8"/>
+              <w:bottom w:val="single" w:sz="4" w:space="0" w:color="AEC6D8"/>
+              <w:right w:val="single" w:sz="4" w:space="0" w:color="AEC6D8"/>
+            </w:tcBorders>
+            <w:shd w:val="clear" w:color="auto" w:fill="FFFFFF"/>
+            <w:tcMar>
+              <w:top w:w="70" w:type="dxa"/>
+              <w:left w:w="140" w:type="dxa"/>
+              <w:bottom w:w="70" w:type="dxa"/>
+              <w:right w:w="140" w:type="dxa"/>
+            </w:tcMar>
+            <w:vAlign w:val="center"/>
+          </w:tcPr>
+          <w:p>
+            <w:r>
+              <w:rPr>
+                <w:sz w:val="19"/>
+                <w:szCs w:val="19"/>
+              </w:rPr>
+              <w:t xml:space="preserve">POST</w:t>
+            </w:r>
+          </w:p>
+        </w:tc>
+        <w:tc>
+          <w:tcPr>
+            <w:tcW w:w="4760" w:type="dxa"/>
+            <w:tcBorders>
+              <w:top w:val="single" w:sz="4" w:space="0" w:color="AEC6D8"/>
+              <w:left w:val="single" w:sz="4" w:space="0" w:color="AEC6D8"/>
+              <w:bottom w:val="single" w:sz="4" w:space="0" w:color="AEC6D8"/>
+              <w:right w:val="single" w:sz="4" w:space="0" w:color="AEC6D8"/>
+            </w:tcBorders>
+            <w:shd w:val="clear" w:color="auto" w:fill="FFFFFF"/>
+            <w:tcMar>
+              <w:top w:w="70" w:type="dxa"/>
+              <w:left w:w="140" w:type="dxa"/>
+              <w:bottom w:w="70" w:type="dxa"/>
+              <w:right w:w="140" w:type="dxa"/>
+            </w:tcMar>
+            <w:vAlign w:val="center"/>
+          </w:tcPr>
+          <w:p>
+            <w:r>
+              <w:rPr>
+                <w:sz w:val="19"/>
+                <w:szCs w:val="19"/>
+              </w:rPr>
+              <w:t xml:space="preserve">Aplica o resultado às tarefas (quadrante e prioridade).</w:t>
+            </w:r>
+          </w:p>
+        </w:tc>
+      </w:tr>
     </w:tbl>
     <w:p>
       <w:pPr>
@@ -9592,6 +10696,1502 @@
                 <w:szCs w:val="19"/>
               </w:rPr>
               <w:t xml:space="preserve">domain/, application/, infrastructure/ (Prisma), presentation/ (controllers, DTOs, guards), modules/</w:t>
+            </w:r>
+          </w:p>
+        </w:tc>
+      </w:tr>
+    </w:tbl>
+    <w:p>
+      <w:pPr>
+        <w:spacing w:before="200" w:after="80"/>
+      </w:pPr>
+      <w:r>
+        <w:rPr>
+          <w:b/>
+          <w:bCs/>
+          <w:color w:val="003366"/>
+          <w:sz w:val="22"/>
+          <w:szCs w:val="22"/>
+        </w:rPr>
+        <w:t xml:space="preserve">5.10 Feature — Priorização com IA (Matriz de Eisenhower)</w:t>
+      </w:r>
+    </w:p>
+    <w:p>
+      <w:pPr>
+        <w:spacing w:before="60" w:after="60"/>
+      </w:pPr>
+      <w:r>
+        <w:t xml:space="preserve">A IA sugere um quadrante de Eisenhower para cada tarefa pendente e o usuário decide em cards no estilo Tinder (→ aceita, ← rejeita e escolhe, ↑ Fazer agora). A IA ajusta as sugestões conforme as decisões. A feature é somente online (RN-14) e nada é alterado antes da confirmação (RN-13).</w:t>
+      </w:r>
+    </w:p>
+    <w:p>
+      <w:pPr>
+        <w:spacing w:before="60" w:after="60"/>
+      </w:pPr>
+      <w:r>
+        <w:t xml:space="preserve">A IA é própria do time e será implementada depois (REST-10). Por isso ela fica atrás da porta TaskPrioritizer no backend: os Use Cases dependem só do contrato abaixo, e uma implementação de desenvolvimento (stub determinístico baseado em prazo e prioridade) permite construir app e API antes da IA ficar pronta.</w:t>
+      </w:r>
+    </w:p>
+    <w:tbl>
+      <w:tblPr>
+        <w:tblW w:w="9360" w:type="dxa"/>
+        <w:tblBorders>
+          <w:top w:val="single" w:sz="4" w:space="0" w:color="auto"/>
+          <w:left w:val="single" w:sz="4" w:space="0" w:color="auto"/>
+          <w:bottom w:val="single" w:sz="4" w:space="0" w:color="auto"/>
+          <w:right w:val="single" w:sz="4" w:space="0" w:color="auto"/>
+          <w:insideH w:val="single" w:sz="4" w:space="0" w:color="auto"/>
+          <w:insideV w:val="single" w:sz="4" w:space="0" w:color="auto"/>
+        </w:tblBorders>
+        <w:tblCellMar>
+          <w:left w:w="10" w:type="dxa"/>
+          <w:right w:w="10" w:type="dxa"/>
+        </w:tblCellMar>
+        <w:tblLook w:val="0000" w:firstRow="0" w:lastRow="0" w:firstColumn="0" w:lastColumn="0" w:noHBand="0" w:noVBand="0"/>
+      </w:tblPr>
+      <w:tblGrid>
+        <w:gridCol w:w="2200"/>
+        <w:gridCol w:w="2400"/>
+        <w:gridCol w:w="4760"/>
+      </w:tblGrid>
+      <w:tr>
+        <w:tblPrEx>
+          <w:tblCellMar>
+            <w:top w:w="0" w:type="dxa"/>
+            <w:bottom w:w="0" w:type="dxa"/>
+          </w:tblCellMar>
+        </w:tblPrEx>
+        <w:trPr>
+          <w:tblHeader/>
+        </w:trPr>
+        <w:tc>
+          <w:tcPr>
+            <w:tcW w:w="2200" w:type="dxa"/>
+            <w:tcBorders>
+              <w:top w:val="single" w:sz="4" w:space="0" w:color="AEC6D8"/>
+              <w:left w:val="single" w:sz="4" w:space="0" w:color="AEC6D8"/>
+              <w:bottom w:val="single" w:sz="4" w:space="0" w:color="AEC6D8"/>
+              <w:right w:val="single" w:sz="4" w:space="0" w:color="AEC6D8"/>
+            </w:tcBorders>
+            <w:shd w:val="clear" w:color="auto" w:fill="002855"/>
+            <w:tcMar>
+              <w:top w:w="80" w:type="dxa"/>
+              <w:left w:w="140" w:type="dxa"/>
+              <w:bottom w:w="80" w:type="dxa"/>
+              <w:right w:w="140" w:type="dxa"/>
+            </w:tcMar>
+            <w:vAlign w:val="center"/>
+          </w:tcPr>
+          <w:p>
+            <w:r>
+              <w:rPr>
+                <w:b/>
+                <w:bCs/>
+                <w:color w:val="FFFFFF"/>
+                <w:sz w:val="18"/>
+                <w:szCs w:val="18"/>
+              </w:rPr>
+              <w:t xml:space="preserve">Elemento</w:t>
+            </w:r>
+          </w:p>
+        </w:tc>
+        <w:tc>
+          <w:tcPr>
+            <w:tcW w:w="2400" w:type="dxa"/>
+            <w:tcBorders>
+              <w:top w:val="single" w:sz="4" w:space="0" w:color="AEC6D8"/>
+              <w:left w:val="single" w:sz="4" w:space="0" w:color="AEC6D8"/>
+              <w:bottom w:val="single" w:sz="4" w:space="0" w:color="AEC6D8"/>
+              <w:right w:val="single" w:sz="4" w:space="0" w:color="AEC6D8"/>
+            </w:tcBorders>
+            <w:shd w:val="clear" w:color="auto" w:fill="002855"/>
+            <w:tcMar>
+              <w:top w:w="80" w:type="dxa"/>
+              <w:left w:w="140" w:type="dxa"/>
+              <w:bottom w:w="80" w:type="dxa"/>
+              <w:right w:w="140" w:type="dxa"/>
+            </w:tcMar>
+            <w:vAlign w:val="center"/>
+          </w:tcPr>
+          <w:p>
+            <w:r>
+              <w:rPr>
+                <w:b/>
+                <w:bCs/>
+                <w:color w:val="FFFFFF"/>
+                <w:sz w:val="18"/>
+                <w:szCs w:val="18"/>
+              </w:rPr>
+              <w:t xml:space="preserve">Camada</w:t>
+            </w:r>
+          </w:p>
+        </w:tc>
+        <w:tc>
+          <w:tcPr>
+            <w:tcW w:w="4760" w:type="dxa"/>
+            <w:tcBorders>
+              <w:top w:val="single" w:sz="4" w:space="0" w:color="AEC6D8"/>
+              <w:left w:val="single" w:sz="4" w:space="0" w:color="AEC6D8"/>
+              <w:bottom w:val="single" w:sz="4" w:space="0" w:color="AEC6D8"/>
+              <w:right w:val="single" w:sz="4" w:space="0" w:color="AEC6D8"/>
+            </w:tcBorders>
+            <w:shd w:val="clear" w:color="auto" w:fill="002855"/>
+            <w:tcMar>
+              <w:top w:w="80" w:type="dxa"/>
+              <w:left w:w="140" w:type="dxa"/>
+              <w:bottom w:w="80" w:type="dxa"/>
+              <w:right w:w="140" w:type="dxa"/>
+            </w:tcMar>
+            <w:vAlign w:val="center"/>
+          </w:tcPr>
+          <w:p>
+            <w:r>
+              <w:rPr>
+                <w:b/>
+                <w:bCs/>
+                <w:color w:val="FFFFFF"/>
+                <w:sz w:val="18"/>
+                <w:szCs w:val="18"/>
+              </w:rPr>
+              <w:t xml:space="preserve">Responsabilidade</w:t>
+            </w:r>
+          </w:p>
+        </w:tc>
+      </w:tr>
+      <w:tr>
+        <w:tblPrEx>
+          <w:tblCellMar>
+            <w:top w:w="0" w:type="dxa"/>
+            <w:bottom w:w="0" w:type="dxa"/>
+          </w:tblCellMar>
+        </w:tblPrEx>
+        <w:tc>
+          <w:tcPr>
+            <w:tcW w:w="2200" w:type="dxa"/>
+            <w:tcBorders>
+              <w:top w:val="single" w:sz="4" w:space="0" w:color="AEC6D8"/>
+              <w:left w:val="single" w:sz="4" w:space="0" w:color="AEC6D8"/>
+              <w:bottom w:val="single" w:sz="4" w:space="0" w:color="AEC6D8"/>
+              <w:right w:val="single" w:sz="4" w:space="0" w:color="AEC6D8"/>
+            </w:tcBorders>
+            <w:shd w:val="clear" w:color="auto" w:fill="FFFFFF"/>
+            <w:tcMar>
+              <w:top w:w="70" w:type="dxa"/>
+              <w:left w:w="140" w:type="dxa"/>
+              <w:bottom w:w="70" w:type="dxa"/>
+              <w:right w:w="140" w:type="dxa"/>
+            </w:tcMar>
+            <w:vAlign w:val="center"/>
+          </w:tcPr>
+          <w:p>
+            <w:r>
+              <w:rPr>
+                <w:sz w:val="19"/>
+                <w:szCs w:val="19"/>
+              </w:rPr>
+              <w:t xml:space="preserve">TaskPrioritizer (porta)</w:t>
+            </w:r>
+          </w:p>
+        </w:tc>
+        <w:tc>
+          <w:tcPr>
+            <w:tcW w:w="2400" w:type="dxa"/>
+            <w:tcBorders>
+              <w:top w:val="single" w:sz="4" w:space="0" w:color="AEC6D8"/>
+              <w:left w:val="single" w:sz="4" w:space="0" w:color="AEC6D8"/>
+              <w:bottom w:val="single" w:sz="4" w:space="0" w:color="AEC6D8"/>
+              <w:right w:val="single" w:sz="4" w:space="0" w:color="AEC6D8"/>
+            </w:tcBorders>
+            <w:shd w:val="clear" w:color="auto" w:fill="FFFFFF"/>
+            <w:tcMar>
+              <w:top w:w="70" w:type="dxa"/>
+              <w:left w:w="140" w:type="dxa"/>
+              <w:bottom w:w="70" w:type="dxa"/>
+              <w:right w:w="140" w:type="dxa"/>
+            </w:tcMar>
+            <w:vAlign w:val="center"/>
+          </w:tcPr>
+          <w:p>
+            <w:r>
+              <w:rPr>
+                <w:sz w:val="19"/>
+                <w:szCs w:val="19"/>
+              </w:rPr>
+              <w:t xml:space="preserve">Domínio — backend</w:t>
+            </w:r>
+          </w:p>
+        </w:tc>
+        <w:tc>
+          <w:tcPr>
+            <w:tcW w:w="4760" w:type="dxa"/>
+            <w:tcBorders>
+              <w:top w:val="single" w:sz="4" w:space="0" w:color="AEC6D8"/>
+              <w:left w:val="single" w:sz="4" w:space="0" w:color="AEC6D8"/>
+              <w:bottom w:val="single" w:sz="4" w:space="0" w:color="AEC6D8"/>
+              <w:right w:val="single" w:sz="4" w:space="0" w:color="AEC6D8"/>
+            </w:tcBorders>
+            <w:shd w:val="clear" w:color="auto" w:fill="FFFFFF"/>
+            <w:tcMar>
+              <w:top w:w="70" w:type="dxa"/>
+              <w:left w:w="140" w:type="dxa"/>
+              <w:bottom w:w="70" w:type="dxa"/>
+              <w:right w:w="140" w:type="dxa"/>
+            </w:tcMar>
+            <w:vAlign w:val="center"/>
+          </w:tcPr>
+          <w:p>
+            <w:r>
+              <w:rPr>
+                <w:sz w:val="19"/>
+                <w:szCs w:val="19"/>
+              </w:rPr>
+              <w:t xml:space="preserve">Contrato da IA. Entrada: tarefas pendentes (título, descrição, prazo, prioridade, estimativa) e histórico de decisões do usuário. Saída por tarefa: quadrante, justificativa curta e confiança (0–1).</w:t>
+            </w:r>
+          </w:p>
+        </w:tc>
+      </w:tr>
+      <w:tr>
+        <w:tblPrEx>
+          <w:tblCellMar>
+            <w:top w:w="0" w:type="dxa"/>
+            <w:bottom w:w="0" w:type="dxa"/>
+          </w:tblCellMar>
+        </w:tblPrEx>
+        <w:tc>
+          <w:tcPr>
+            <w:tcW w:w="2200" w:type="dxa"/>
+            <w:tcBorders>
+              <w:top w:val="single" w:sz="4" w:space="0" w:color="AEC6D8"/>
+              <w:left w:val="single" w:sz="4" w:space="0" w:color="AEC6D8"/>
+              <w:bottom w:val="single" w:sz="4" w:space="0" w:color="AEC6D8"/>
+              <w:right w:val="single" w:sz="4" w:space="0" w:color="AEC6D8"/>
+            </w:tcBorders>
+            <w:shd w:val="clear" w:color="auto" w:fill="EBF3FA"/>
+            <w:tcMar>
+              <w:top w:w="70" w:type="dxa"/>
+              <w:left w:w="140" w:type="dxa"/>
+              <w:bottom w:w="70" w:type="dxa"/>
+              <w:right w:w="140" w:type="dxa"/>
+            </w:tcMar>
+            <w:vAlign w:val="center"/>
+          </w:tcPr>
+          <w:p>
+            <w:r>
+              <w:rPr>
+                <w:sz w:val="19"/>
+                <w:szCs w:val="19"/>
+              </w:rPr>
+              <w:t xml:space="preserve">CreatePrioritizationSession, RecordDecision, ApplyPrioritization</w:t>
+            </w:r>
+          </w:p>
+        </w:tc>
+        <w:tc>
+          <w:tcPr>
+            <w:tcW w:w="2400" w:type="dxa"/>
+            <w:tcBorders>
+              <w:top w:val="single" w:sz="4" w:space="0" w:color="AEC6D8"/>
+              <w:left w:val="single" w:sz="4" w:space="0" w:color="AEC6D8"/>
+              <w:bottom w:val="single" w:sz="4" w:space="0" w:color="AEC6D8"/>
+              <w:right w:val="single" w:sz="4" w:space="0" w:color="AEC6D8"/>
+            </w:tcBorders>
+            <w:shd w:val="clear" w:color="auto" w:fill="EBF3FA"/>
+            <w:tcMar>
+              <w:top w:w="70" w:type="dxa"/>
+              <w:left w:w="140" w:type="dxa"/>
+              <w:bottom w:w="70" w:type="dxa"/>
+              <w:right w:w="140" w:type="dxa"/>
+            </w:tcMar>
+            <w:vAlign w:val="center"/>
+          </w:tcPr>
+          <w:p>
+            <w:r>
+              <w:rPr>
+                <w:sz w:val="19"/>
+                <w:szCs w:val="19"/>
+              </w:rPr>
+              <w:t xml:space="preserve">Aplicação — backend</w:t>
+            </w:r>
+          </w:p>
+        </w:tc>
+        <w:tc>
+          <w:tcPr>
+            <w:tcW w:w="4760" w:type="dxa"/>
+            <w:tcBorders>
+              <w:top w:val="single" w:sz="4" w:space="0" w:color="AEC6D8"/>
+              <w:left w:val="single" w:sz="4" w:space="0" w:color="AEC6D8"/>
+              <w:bottom w:val="single" w:sz="4" w:space="0" w:color="AEC6D8"/>
+              <w:right w:val="single" w:sz="4" w:space="0" w:color="AEC6D8"/>
+            </w:tcBorders>
+            <w:shd w:val="clear" w:color="auto" w:fill="EBF3FA"/>
+            <w:tcMar>
+              <w:top w:w="70" w:type="dxa"/>
+              <w:left w:w="140" w:type="dxa"/>
+              <w:bottom w:w="70" w:type="dxa"/>
+              <w:right w:w="140" w:type="dxa"/>
+            </w:tcMar>
+            <w:vAlign w:val="center"/>
+          </w:tcPr>
+          <w:p>
+            <w:r>
+              <w:rPr>
+                <w:sz w:val="19"/>
+                <w:szCs w:val="19"/>
+              </w:rPr>
+              <w:t xml:space="preserve">Abrem a sessão, registram decisões pedindo novas sugestões à porta e aplicam o resultado às tarefas.</w:t>
+            </w:r>
+          </w:p>
+        </w:tc>
+      </w:tr>
+      <w:tr>
+        <w:tblPrEx>
+          <w:tblCellMar>
+            <w:top w:w="0" w:type="dxa"/>
+            <w:bottom w:w="0" w:type="dxa"/>
+          </w:tblCellMar>
+        </w:tblPrEx>
+        <w:tc>
+          <w:tcPr>
+            <w:tcW w:w="2200" w:type="dxa"/>
+            <w:tcBorders>
+              <w:top w:val="single" w:sz="4" w:space="0" w:color="AEC6D8"/>
+              <w:left w:val="single" w:sz="4" w:space="0" w:color="AEC6D8"/>
+              <w:bottom w:val="single" w:sz="4" w:space="0" w:color="AEC6D8"/>
+              <w:right w:val="single" w:sz="4" w:space="0" w:color="AEC6D8"/>
+            </w:tcBorders>
+            <w:shd w:val="clear" w:color="auto" w:fill="FFFFFF"/>
+            <w:tcMar>
+              <w:top w:w="70" w:type="dxa"/>
+              <w:left w:w="140" w:type="dxa"/>
+              <w:bottom w:w="70" w:type="dxa"/>
+              <w:right w:w="140" w:type="dxa"/>
+            </w:tcMar>
+            <w:vAlign w:val="center"/>
+          </w:tcPr>
+          <w:p>
+            <w:r>
+              <w:rPr>
+                <w:sz w:val="19"/>
+                <w:szCs w:val="19"/>
+              </w:rPr>
+              <w:t xml:space="preserve">StubPrioritizer / implementação da IA própria</w:t>
+            </w:r>
+          </w:p>
+        </w:tc>
+        <w:tc>
+          <w:tcPr>
+            <w:tcW w:w="2400" w:type="dxa"/>
+            <w:tcBorders>
+              <w:top w:val="single" w:sz="4" w:space="0" w:color="AEC6D8"/>
+              <w:left w:val="single" w:sz="4" w:space="0" w:color="AEC6D8"/>
+              <w:bottom w:val="single" w:sz="4" w:space="0" w:color="AEC6D8"/>
+              <w:right w:val="single" w:sz="4" w:space="0" w:color="AEC6D8"/>
+            </w:tcBorders>
+            <w:shd w:val="clear" w:color="auto" w:fill="FFFFFF"/>
+            <w:tcMar>
+              <w:top w:w="70" w:type="dxa"/>
+              <w:left w:w="140" w:type="dxa"/>
+              <w:bottom w:w="70" w:type="dxa"/>
+              <w:right w:w="140" w:type="dxa"/>
+            </w:tcMar>
+            <w:vAlign w:val="center"/>
+          </w:tcPr>
+          <w:p>
+            <w:r>
+              <w:rPr>
+                <w:sz w:val="19"/>
+                <w:szCs w:val="19"/>
+              </w:rPr>
+              <w:t xml:space="preserve">Infraestrutura — backend</w:t>
+            </w:r>
+          </w:p>
+        </w:tc>
+        <w:tc>
+          <w:tcPr>
+            <w:tcW w:w="4760" w:type="dxa"/>
+            <w:tcBorders>
+              <w:top w:val="single" w:sz="4" w:space="0" w:color="AEC6D8"/>
+              <w:left w:val="single" w:sz="4" w:space="0" w:color="AEC6D8"/>
+              <w:bottom w:val="single" w:sz="4" w:space="0" w:color="AEC6D8"/>
+              <w:right w:val="single" w:sz="4" w:space="0" w:color="AEC6D8"/>
+            </w:tcBorders>
+            <w:shd w:val="clear" w:color="auto" w:fill="FFFFFF"/>
+            <w:tcMar>
+              <w:top w:w="70" w:type="dxa"/>
+              <w:left w:w="140" w:type="dxa"/>
+              <w:bottom w:w="70" w:type="dxa"/>
+              <w:right w:w="140" w:type="dxa"/>
+            </w:tcMar>
+            <w:vAlign w:val="center"/>
+          </w:tcPr>
+          <w:p>
+            <w:r>
+              <w:rPr>
+                <w:sz w:val="19"/>
+                <w:szCs w:val="19"/>
+              </w:rPr>
+              <w:t xml:space="preserve">Stub para desenvolvimento e testes; a IA do time substitui o stub sem alterar o resto (RNF-16).</w:t>
+            </w:r>
+          </w:p>
+        </w:tc>
+      </w:tr>
+      <w:tr>
+        <w:tblPrEx>
+          <w:tblCellMar>
+            <w:top w:w="0" w:type="dxa"/>
+            <w:bottom w:w="0" w:type="dxa"/>
+          </w:tblCellMar>
+        </w:tblPrEx>
+        <w:tc>
+          <w:tcPr>
+            <w:tcW w:w="2200" w:type="dxa"/>
+            <w:tcBorders>
+              <w:top w:val="single" w:sz="4" w:space="0" w:color="AEC6D8"/>
+              <w:left w:val="single" w:sz="4" w:space="0" w:color="AEC6D8"/>
+              <w:bottom w:val="single" w:sz="4" w:space="0" w:color="AEC6D8"/>
+              <w:right w:val="single" w:sz="4" w:space="0" w:color="AEC6D8"/>
+            </w:tcBorders>
+            <w:shd w:val="clear" w:color="auto" w:fill="EBF3FA"/>
+            <w:tcMar>
+              <w:top w:w="70" w:type="dxa"/>
+              <w:left w:w="140" w:type="dxa"/>
+              <w:bottom w:w="70" w:type="dxa"/>
+              <w:right w:w="140" w:type="dxa"/>
+            </w:tcMar>
+            <w:vAlign w:val="center"/>
+          </w:tcPr>
+          <w:p>
+            <w:r>
+              <w:rPr>
+                <w:sz w:val="19"/>
+                <w:szCs w:val="19"/>
+              </w:rPr>
+              <w:t xml:space="preserve">PrioritizationController + DTOs</w:t>
+            </w:r>
+          </w:p>
+        </w:tc>
+        <w:tc>
+          <w:tcPr>
+            <w:tcW w:w="2400" w:type="dxa"/>
+            <w:tcBorders>
+              <w:top w:val="single" w:sz="4" w:space="0" w:color="AEC6D8"/>
+              <w:left w:val="single" w:sz="4" w:space="0" w:color="AEC6D8"/>
+              <w:bottom w:val="single" w:sz="4" w:space="0" w:color="AEC6D8"/>
+              <w:right w:val="single" w:sz="4" w:space="0" w:color="AEC6D8"/>
+            </w:tcBorders>
+            <w:shd w:val="clear" w:color="auto" w:fill="EBF3FA"/>
+            <w:tcMar>
+              <w:top w:w="70" w:type="dxa"/>
+              <w:left w:w="140" w:type="dxa"/>
+              <w:bottom w:w="70" w:type="dxa"/>
+              <w:right w:w="140" w:type="dxa"/>
+            </w:tcMar>
+            <w:vAlign w:val="center"/>
+          </w:tcPr>
+          <w:p>
+            <w:r>
+              <w:rPr>
+                <w:sz w:val="19"/>
+                <w:szCs w:val="19"/>
+              </w:rPr>
+              <w:t xml:space="preserve">Apresentação — backend</w:t>
+            </w:r>
+          </w:p>
+        </w:tc>
+        <w:tc>
+          <w:tcPr>
+            <w:tcW w:w="4760" w:type="dxa"/>
+            <w:tcBorders>
+              <w:top w:val="single" w:sz="4" w:space="0" w:color="AEC6D8"/>
+              <w:left w:val="single" w:sz="4" w:space="0" w:color="AEC6D8"/>
+              <w:bottom w:val="single" w:sz="4" w:space="0" w:color="AEC6D8"/>
+              <w:right w:val="single" w:sz="4" w:space="0" w:color="AEC6D8"/>
+            </w:tcBorders>
+            <w:shd w:val="clear" w:color="auto" w:fill="EBF3FA"/>
+            <w:tcMar>
+              <w:top w:w="70" w:type="dxa"/>
+              <w:left w:w="140" w:type="dxa"/>
+              <w:bottom w:w="70" w:type="dxa"/>
+              <w:right w:w="140" w:type="dxa"/>
+            </w:tcMar>
+            <w:vAlign w:val="center"/>
+          </w:tcPr>
+          <w:p>
+            <w:r>
+              <w:rPr>
+                <w:sz w:val="19"/>
+                <w:szCs w:val="19"/>
+              </w:rPr>
+              <w:t xml:space="preserve">Endpoints /prioritization/* (seção 5.7), protegidos por JWT.</w:t>
+            </w:r>
+          </w:p>
+        </w:tc>
+      </w:tr>
+      <w:tr>
+        <w:tblPrEx>
+          <w:tblCellMar>
+            <w:top w:w="0" w:type="dxa"/>
+            <w:bottom w:w="0" w:type="dxa"/>
+          </w:tblCellMar>
+        </w:tblPrEx>
+        <w:tc>
+          <w:tcPr>
+            <w:tcW w:w="2200" w:type="dxa"/>
+            <w:tcBorders>
+              <w:top w:val="single" w:sz="4" w:space="0" w:color="AEC6D8"/>
+              <w:left w:val="single" w:sz="4" w:space="0" w:color="AEC6D8"/>
+              <w:bottom w:val="single" w:sz="4" w:space="0" w:color="AEC6D8"/>
+              <w:right w:val="single" w:sz="4" w:space="0" w:color="AEC6D8"/>
+            </w:tcBorders>
+            <w:shd w:val="clear" w:color="auto" w:fill="FFFFFF"/>
+            <w:tcMar>
+              <w:top w:w="70" w:type="dxa"/>
+              <w:left w:w="140" w:type="dxa"/>
+              <w:bottom w:w="70" w:type="dxa"/>
+              <w:right w:w="140" w:type="dxa"/>
+            </w:tcMar>
+            <w:vAlign w:val="center"/>
+          </w:tcPr>
+          <w:p>
+            <w:r>
+              <w:rPr>
+                <w:sz w:val="19"/>
+                <w:szCs w:val="19"/>
+              </w:rPr>
+              <w:t xml:space="preserve">StartPrioritization, DecideTask, UndoDecision, ApplyPrioritization</w:t>
+            </w:r>
+          </w:p>
+        </w:tc>
+        <w:tc>
+          <w:tcPr>
+            <w:tcW w:w="2400" w:type="dxa"/>
+            <w:tcBorders>
+              <w:top w:val="single" w:sz="4" w:space="0" w:color="AEC6D8"/>
+              <w:left w:val="single" w:sz="4" w:space="0" w:color="AEC6D8"/>
+              <w:bottom w:val="single" w:sz="4" w:space="0" w:color="AEC6D8"/>
+              <w:right w:val="single" w:sz="4" w:space="0" w:color="AEC6D8"/>
+            </w:tcBorders>
+            <w:shd w:val="clear" w:color="auto" w:fill="FFFFFF"/>
+            <w:tcMar>
+              <w:top w:w="70" w:type="dxa"/>
+              <w:left w:w="140" w:type="dxa"/>
+              <w:bottom w:w="70" w:type="dxa"/>
+              <w:right w:w="140" w:type="dxa"/>
+            </w:tcMar>
+            <w:vAlign w:val="center"/>
+          </w:tcPr>
+          <w:p>
+            <w:r>
+              <w:rPr>
+                <w:sz w:val="19"/>
+                <w:szCs w:val="19"/>
+              </w:rPr>
+              <w:t xml:space="preserve">Aplicação — app</w:t>
+            </w:r>
+          </w:p>
+        </w:tc>
+        <w:tc>
+          <w:tcPr>
+            <w:tcW w:w="4760" w:type="dxa"/>
+            <w:tcBorders>
+              <w:top w:val="single" w:sz="4" w:space="0" w:color="AEC6D8"/>
+              <w:left w:val="single" w:sz="4" w:space="0" w:color="AEC6D8"/>
+              <w:bottom w:val="single" w:sz="4" w:space="0" w:color="AEC6D8"/>
+              <w:right w:val="single" w:sz="4" w:space="0" w:color="AEC6D8"/>
+            </w:tcBorders>
+            <w:shd w:val="clear" w:color="auto" w:fill="FFFFFF"/>
+            <w:tcMar>
+              <w:top w:w="70" w:type="dxa"/>
+              <w:left w:w="140" w:type="dxa"/>
+              <w:bottom w:w="70" w:type="dxa"/>
+              <w:right w:w="140" w:type="dxa"/>
+            </w:tcMar>
+            <w:vAlign w:val="center"/>
+          </w:tcPr>
+          <w:p>
+            <w:r>
+              <w:rPr>
+                <w:sz w:val="19"/>
+                <w:szCs w:val="19"/>
+              </w:rPr>
+              <w:t xml:space="preserve">Use Cases do app (seção 5.3).</w:t>
+            </w:r>
+          </w:p>
+        </w:tc>
+      </w:tr>
+      <w:tr>
+        <w:tblPrEx>
+          <w:tblCellMar>
+            <w:top w:w="0" w:type="dxa"/>
+            <w:bottom w:w="0" w:type="dxa"/>
+          </w:tblCellMar>
+        </w:tblPrEx>
+        <w:tc>
+          <w:tcPr>
+            <w:tcW w:w="2200" w:type="dxa"/>
+            <w:tcBorders>
+              <w:top w:val="single" w:sz="4" w:space="0" w:color="AEC6D8"/>
+              <w:left w:val="single" w:sz="4" w:space="0" w:color="AEC6D8"/>
+              <w:bottom w:val="single" w:sz="4" w:space="0" w:color="AEC6D8"/>
+              <w:right w:val="single" w:sz="4" w:space="0" w:color="AEC6D8"/>
+            </w:tcBorders>
+            <w:shd w:val="clear" w:color="auto" w:fill="EBF3FA"/>
+            <w:tcMar>
+              <w:top w:w="70" w:type="dxa"/>
+              <w:left w:w="140" w:type="dxa"/>
+              <w:bottom w:w="70" w:type="dxa"/>
+              <w:right w:w="140" w:type="dxa"/>
+            </w:tcMar>
+            <w:vAlign w:val="center"/>
+          </w:tcPr>
+          <w:p>
+            <w:r>
+              <w:rPr>
+                <w:sz w:val="19"/>
+                <w:szCs w:val="19"/>
+              </w:rPr>
+              <w:t xml:space="preserve">prioritizationStore + PrioritizationScreen / ResultScreen</w:t>
+            </w:r>
+          </w:p>
+        </w:tc>
+        <w:tc>
+          <w:tcPr>
+            <w:tcW w:w="2400" w:type="dxa"/>
+            <w:tcBorders>
+              <w:top w:val="single" w:sz="4" w:space="0" w:color="AEC6D8"/>
+              <w:left w:val="single" w:sz="4" w:space="0" w:color="AEC6D8"/>
+              <w:bottom w:val="single" w:sz="4" w:space="0" w:color="AEC6D8"/>
+              <w:right w:val="single" w:sz="4" w:space="0" w:color="AEC6D8"/>
+            </w:tcBorders>
+            <w:shd w:val="clear" w:color="auto" w:fill="EBF3FA"/>
+            <w:tcMar>
+              <w:top w:w="70" w:type="dxa"/>
+              <w:left w:w="140" w:type="dxa"/>
+              <w:bottom w:w="70" w:type="dxa"/>
+              <w:right w:w="140" w:type="dxa"/>
+            </w:tcMar>
+            <w:vAlign w:val="center"/>
+          </w:tcPr>
+          <w:p>
+            <w:r>
+              <w:rPr>
+                <w:sz w:val="19"/>
+                <w:szCs w:val="19"/>
+              </w:rPr>
+              <w:t xml:space="preserve">Apresentação — app</w:t>
+            </w:r>
+          </w:p>
+        </w:tc>
+        <w:tc>
+          <w:tcPr>
+            <w:tcW w:w="4760" w:type="dxa"/>
+            <w:tcBorders>
+              <w:top w:val="single" w:sz="4" w:space="0" w:color="AEC6D8"/>
+              <w:left w:val="single" w:sz="4" w:space="0" w:color="AEC6D8"/>
+              <w:bottom w:val="single" w:sz="4" w:space="0" w:color="AEC6D8"/>
+              <w:right w:val="single" w:sz="4" w:space="0" w:color="AEC6D8"/>
+            </w:tcBorders>
+            <w:shd w:val="clear" w:color="auto" w:fill="EBF3FA"/>
+            <w:tcMar>
+              <w:top w:w="70" w:type="dxa"/>
+              <w:left w:w="140" w:type="dxa"/>
+              <w:bottom w:w="70" w:type="dxa"/>
+              <w:right w:w="140" w:type="dxa"/>
+            </w:tcMar>
+            <w:vAlign w:val="center"/>
+          </w:tcPr>
+          <w:p>
+            <w:r>
+              <w:rPr>
+                <w:sz w:val="19"/>
+                <w:szCs w:val="19"/>
+              </w:rPr>
+              <w:t xml:space="preserve">Pilha de cards com gestos, seletor de quadrante, matriz 2×2 e estados offline/carregando/erro.</w:t>
+            </w:r>
+          </w:p>
+        </w:tc>
+      </w:tr>
+    </w:tbl>
+    <w:p>
+      <w:pPr>
+        <w:spacing w:before="200" w:after="80"/>
+      </w:pPr>
+      <w:r>
+        <w:rPr>
+          <w:b/>
+          <w:bCs/>
+          <w:color w:val="003366"/>
+          <w:sz w:val="22"/>
+          <w:szCs w:val="22"/>
+        </w:rPr>
+        <w:t xml:space="preserve">Fluxo de telas da priorização</w:t>
+      </w:r>
+    </w:p>
+    <w:tbl>
+      <w:tblPr>
+        <w:tblW w:w="9360" w:type="dxa"/>
+        <w:tblBorders>
+          <w:top w:val="single" w:sz="4" w:space="0" w:color="auto"/>
+          <w:left w:val="single" w:sz="4" w:space="0" w:color="auto"/>
+          <w:bottom w:val="single" w:sz="4" w:space="0" w:color="auto"/>
+          <w:right w:val="single" w:sz="4" w:space="0" w:color="auto"/>
+          <w:insideH w:val="single" w:sz="4" w:space="0" w:color="auto"/>
+          <w:insideV w:val="single" w:sz="4" w:space="0" w:color="auto"/>
+        </w:tblBorders>
+        <w:tblCellMar>
+          <w:left w:w="10" w:type="dxa"/>
+          <w:right w:w="10" w:type="dxa"/>
+        </w:tblCellMar>
+        <w:tblLook w:val="0000" w:firstRow="0" w:lastRow="0" w:firstColumn="0" w:lastColumn="0" w:noHBand="0" w:noVBand="0"/>
+      </w:tblPr>
+      <w:tblGrid>
+        <w:gridCol w:w="2200"/>
+        <w:gridCol w:w="2400"/>
+        <w:gridCol w:w="4760"/>
+      </w:tblGrid>
+      <w:tr>
+        <w:tblPrEx>
+          <w:tblCellMar>
+            <w:top w:w="0" w:type="dxa"/>
+            <w:bottom w:w="0" w:type="dxa"/>
+          </w:tblCellMar>
+        </w:tblPrEx>
+        <w:trPr>
+          <w:tblHeader/>
+        </w:trPr>
+        <w:tc>
+          <w:tcPr>
+            <w:tcW w:w="2200" w:type="dxa"/>
+            <w:tcBorders>
+              <w:top w:val="single" w:sz="4" w:space="0" w:color="AEC6D8"/>
+              <w:left w:val="single" w:sz="4" w:space="0" w:color="AEC6D8"/>
+              <w:bottom w:val="single" w:sz="4" w:space="0" w:color="AEC6D8"/>
+              <w:right w:val="single" w:sz="4" w:space="0" w:color="AEC6D8"/>
+            </w:tcBorders>
+            <w:shd w:val="clear" w:color="auto" w:fill="002855"/>
+            <w:tcMar>
+              <w:top w:w="80" w:type="dxa"/>
+              <w:left w:w="140" w:type="dxa"/>
+              <w:bottom w:w="80" w:type="dxa"/>
+              <w:right w:w="140" w:type="dxa"/>
+            </w:tcMar>
+            <w:vAlign w:val="center"/>
+          </w:tcPr>
+          <w:p>
+            <w:r>
+              <w:rPr>
+                <w:b/>
+                <w:bCs/>
+                <w:color w:val="FFFFFF"/>
+                <w:sz w:val="18"/>
+                <w:szCs w:val="18"/>
+              </w:rPr>
+              <w:t xml:space="preserve">Passo</w:t>
+            </w:r>
+          </w:p>
+        </w:tc>
+        <w:tc>
+          <w:tcPr>
+            <w:tcW w:w="2400" w:type="dxa"/>
+            <w:tcBorders>
+              <w:top w:val="single" w:sz="4" w:space="0" w:color="AEC6D8"/>
+              <w:left w:val="single" w:sz="4" w:space="0" w:color="AEC6D8"/>
+              <w:bottom w:val="single" w:sz="4" w:space="0" w:color="AEC6D8"/>
+              <w:right w:val="single" w:sz="4" w:space="0" w:color="AEC6D8"/>
+            </w:tcBorders>
+            <w:shd w:val="clear" w:color="auto" w:fill="002855"/>
+            <w:tcMar>
+              <w:top w:w="80" w:type="dxa"/>
+              <w:left w:w="140" w:type="dxa"/>
+              <w:bottom w:w="80" w:type="dxa"/>
+              <w:right w:w="140" w:type="dxa"/>
+            </w:tcMar>
+            <w:vAlign w:val="center"/>
+          </w:tcPr>
+          <w:p>
+            <w:r>
+              <w:rPr>
+                <w:b/>
+                <w:bCs/>
+                <w:color w:val="FFFFFF"/>
+                <w:sz w:val="18"/>
+                <w:szCs w:val="18"/>
+              </w:rPr>
+              <w:t xml:space="preserve">Tela</w:t>
+            </w:r>
+          </w:p>
+        </w:tc>
+        <w:tc>
+          <w:tcPr>
+            <w:tcW w:w="4760" w:type="dxa"/>
+            <w:tcBorders>
+              <w:top w:val="single" w:sz="4" w:space="0" w:color="AEC6D8"/>
+              <w:left w:val="single" w:sz="4" w:space="0" w:color="AEC6D8"/>
+              <w:bottom w:val="single" w:sz="4" w:space="0" w:color="AEC6D8"/>
+              <w:right w:val="single" w:sz="4" w:space="0" w:color="AEC6D8"/>
+            </w:tcBorders>
+            <w:shd w:val="clear" w:color="auto" w:fill="002855"/>
+            <w:tcMar>
+              <w:top w:w="80" w:type="dxa"/>
+              <w:left w:w="140" w:type="dxa"/>
+              <w:bottom w:w="80" w:type="dxa"/>
+              <w:right w:w="140" w:type="dxa"/>
+            </w:tcMar>
+            <w:vAlign w:val="center"/>
+          </w:tcPr>
+          <w:p>
+            <w:r>
+              <w:rPr>
+                <w:b/>
+                <w:bCs/>
+                <w:color w:val="FFFFFF"/>
+                <w:sz w:val="18"/>
+                <w:szCs w:val="18"/>
+              </w:rPr>
+              <w:t xml:space="preserve">O que acontece</w:t>
+            </w:r>
+          </w:p>
+        </w:tc>
+      </w:tr>
+      <w:tr>
+        <w:tblPrEx>
+          <w:tblCellMar>
+            <w:top w:w="0" w:type="dxa"/>
+            <w:bottom w:w="0" w:type="dxa"/>
+          </w:tblCellMar>
+        </w:tblPrEx>
+        <w:tc>
+          <w:tcPr>
+            <w:tcW w:w="2200" w:type="dxa"/>
+            <w:tcBorders>
+              <w:top w:val="single" w:sz="4" w:space="0" w:color="AEC6D8"/>
+              <w:left w:val="single" w:sz="4" w:space="0" w:color="AEC6D8"/>
+              <w:bottom w:val="single" w:sz="4" w:space="0" w:color="AEC6D8"/>
+              <w:right w:val="single" w:sz="4" w:space="0" w:color="AEC6D8"/>
+            </w:tcBorders>
+            <w:shd w:val="clear" w:color="auto" w:fill="FFFFFF"/>
+            <w:tcMar>
+              <w:top w:w="70" w:type="dxa"/>
+              <w:left w:w="140" w:type="dxa"/>
+              <w:bottom w:w="70" w:type="dxa"/>
+              <w:right w:w="140" w:type="dxa"/>
+            </w:tcMar>
+            <w:vAlign w:val="center"/>
+          </w:tcPr>
+          <w:p>
+            <w:r>
+              <w:rPr>
+                <w:sz w:val="19"/>
+                <w:szCs w:val="19"/>
+              </w:rPr>
+              <w:t xml:space="preserve">1</w:t>
+            </w:r>
+          </w:p>
+        </w:tc>
+        <w:tc>
+          <w:tcPr>
+            <w:tcW w:w="2400" w:type="dxa"/>
+            <w:tcBorders>
+              <w:top w:val="single" w:sz="4" w:space="0" w:color="AEC6D8"/>
+              <w:left w:val="single" w:sz="4" w:space="0" w:color="AEC6D8"/>
+              <w:bottom w:val="single" w:sz="4" w:space="0" w:color="AEC6D8"/>
+              <w:right w:val="single" w:sz="4" w:space="0" w:color="AEC6D8"/>
+            </w:tcBorders>
+            <w:shd w:val="clear" w:color="auto" w:fill="FFFFFF"/>
+            <w:tcMar>
+              <w:top w:w="70" w:type="dxa"/>
+              <w:left w:w="140" w:type="dxa"/>
+              <w:bottom w:w="70" w:type="dxa"/>
+              <w:right w:w="140" w:type="dxa"/>
+            </w:tcMar>
+            <w:vAlign w:val="center"/>
+          </w:tcPr>
+          <w:p>
+            <w:r>
+              <w:rPr>
+                <w:sz w:val="19"/>
+                <w:szCs w:val="19"/>
+              </w:rPr>
+              <w:t xml:space="preserve">Home</w:t>
+            </w:r>
+          </w:p>
+        </w:tc>
+        <w:tc>
+          <w:tcPr>
+            <w:tcW w:w="4760" w:type="dxa"/>
+            <w:tcBorders>
+              <w:top w:val="single" w:sz="4" w:space="0" w:color="AEC6D8"/>
+              <w:left w:val="single" w:sz="4" w:space="0" w:color="AEC6D8"/>
+              <w:bottom w:val="single" w:sz="4" w:space="0" w:color="AEC6D8"/>
+              <w:right w:val="single" w:sz="4" w:space="0" w:color="AEC6D8"/>
+            </w:tcBorders>
+            <w:shd w:val="clear" w:color="auto" w:fill="FFFFFF"/>
+            <w:tcMar>
+              <w:top w:w="70" w:type="dxa"/>
+              <w:left w:w="140" w:type="dxa"/>
+              <w:bottom w:w="70" w:type="dxa"/>
+              <w:right w:w="140" w:type="dxa"/>
+            </w:tcMar>
+            <w:vAlign w:val="center"/>
+          </w:tcPr>
+          <w:p>
+            <w:r>
+              <w:rPr>
+                <w:sz w:val="19"/>
+                <w:szCs w:val="19"/>
+              </w:rPr>
+              <w:t xml:space="preserve">Botão "Priorizar com IA" no cabeçalho. Sem internet, abre o estado offline (RN-14).</w:t>
+            </w:r>
+          </w:p>
+        </w:tc>
+      </w:tr>
+      <w:tr>
+        <w:tblPrEx>
+          <w:tblCellMar>
+            <w:top w:w="0" w:type="dxa"/>
+            <w:bottom w:w="0" w:type="dxa"/>
+          </w:tblCellMar>
+        </w:tblPrEx>
+        <w:tc>
+          <w:tcPr>
+            <w:tcW w:w="2200" w:type="dxa"/>
+            <w:tcBorders>
+              <w:top w:val="single" w:sz="4" w:space="0" w:color="AEC6D8"/>
+              <w:left w:val="single" w:sz="4" w:space="0" w:color="AEC6D8"/>
+              <w:bottom w:val="single" w:sz="4" w:space="0" w:color="AEC6D8"/>
+              <w:right w:val="single" w:sz="4" w:space="0" w:color="AEC6D8"/>
+            </w:tcBorders>
+            <w:shd w:val="clear" w:color="auto" w:fill="EBF3FA"/>
+            <w:tcMar>
+              <w:top w:w="70" w:type="dxa"/>
+              <w:left w:w="140" w:type="dxa"/>
+              <w:bottom w:w="70" w:type="dxa"/>
+              <w:right w:w="140" w:type="dxa"/>
+            </w:tcMar>
+            <w:vAlign w:val="center"/>
+          </w:tcPr>
+          <w:p>
+            <w:r>
+              <w:rPr>
+                <w:sz w:val="19"/>
+                <w:szCs w:val="19"/>
+              </w:rPr>
+              <w:t xml:space="preserve">2</w:t>
+            </w:r>
+          </w:p>
+        </w:tc>
+        <w:tc>
+          <w:tcPr>
+            <w:tcW w:w="2400" w:type="dxa"/>
+            <w:tcBorders>
+              <w:top w:val="single" w:sz="4" w:space="0" w:color="AEC6D8"/>
+              <w:left w:val="single" w:sz="4" w:space="0" w:color="AEC6D8"/>
+              <w:bottom w:val="single" w:sz="4" w:space="0" w:color="AEC6D8"/>
+              <w:right w:val="single" w:sz="4" w:space="0" w:color="AEC6D8"/>
+            </w:tcBorders>
+            <w:shd w:val="clear" w:color="auto" w:fill="EBF3FA"/>
+            <w:tcMar>
+              <w:top w:w="70" w:type="dxa"/>
+              <w:left w:w="140" w:type="dxa"/>
+              <w:bottom w:w="70" w:type="dxa"/>
+              <w:right w:w="140" w:type="dxa"/>
+            </w:tcMar>
+            <w:vAlign w:val="center"/>
+          </w:tcPr>
+          <w:p>
+            <w:r>
+              <w:rPr>
+                <w:sz w:val="19"/>
+                <w:szCs w:val="19"/>
+              </w:rPr>
+              <w:t xml:space="preserve">Aviso de privacidade (1º uso)</w:t>
+            </w:r>
+          </w:p>
+        </w:tc>
+        <w:tc>
+          <w:tcPr>
+            <w:tcW w:w="4760" w:type="dxa"/>
+            <w:tcBorders>
+              <w:top w:val="single" w:sz="4" w:space="0" w:color="AEC6D8"/>
+              <w:left w:val="single" w:sz="4" w:space="0" w:color="AEC6D8"/>
+              <w:bottom w:val="single" w:sz="4" w:space="0" w:color="AEC6D8"/>
+              <w:right w:val="single" w:sz="4" w:space="0" w:color="AEC6D8"/>
+            </w:tcBorders>
+            <w:shd w:val="clear" w:color="auto" w:fill="EBF3FA"/>
+            <w:tcMar>
+              <w:top w:w="70" w:type="dxa"/>
+              <w:left w:w="140" w:type="dxa"/>
+              <w:bottom w:w="70" w:type="dxa"/>
+              <w:right w:w="140" w:type="dxa"/>
+            </w:tcMar>
+            <w:vAlign w:val="center"/>
+          </w:tcPr>
+          <w:p>
+            <w:r>
+              <w:rPr>
+                <w:sz w:val="19"/>
+                <w:szCs w:val="19"/>
+              </w:rPr>
+              <w:t xml:space="preserve">Explica quais dados vão para a IA (RN-15); o usuário confirma para seguir.</w:t>
+            </w:r>
+          </w:p>
+        </w:tc>
+      </w:tr>
+      <w:tr>
+        <w:tblPrEx>
+          <w:tblCellMar>
+            <w:top w:w="0" w:type="dxa"/>
+            <w:bottom w:w="0" w:type="dxa"/>
+          </w:tblCellMar>
+        </w:tblPrEx>
+        <w:tc>
+          <w:tcPr>
+            <w:tcW w:w="2200" w:type="dxa"/>
+            <w:tcBorders>
+              <w:top w:val="single" w:sz="4" w:space="0" w:color="AEC6D8"/>
+              <w:left w:val="single" w:sz="4" w:space="0" w:color="AEC6D8"/>
+              <w:bottom w:val="single" w:sz="4" w:space="0" w:color="AEC6D8"/>
+              <w:right w:val="single" w:sz="4" w:space="0" w:color="AEC6D8"/>
+            </w:tcBorders>
+            <w:shd w:val="clear" w:color="auto" w:fill="FFFFFF"/>
+            <w:tcMar>
+              <w:top w:w="70" w:type="dxa"/>
+              <w:left w:w="140" w:type="dxa"/>
+              <w:bottom w:w="70" w:type="dxa"/>
+              <w:right w:w="140" w:type="dxa"/>
+            </w:tcMar>
+            <w:vAlign w:val="center"/>
+          </w:tcPr>
+          <w:p>
+            <w:r>
+              <w:rPr>
+                <w:sz w:val="19"/>
+                <w:szCs w:val="19"/>
+              </w:rPr>
+              <w:t xml:space="preserve">3</w:t>
+            </w:r>
+          </w:p>
+        </w:tc>
+        <w:tc>
+          <w:tcPr>
+            <w:tcW w:w="2400" w:type="dxa"/>
+            <w:tcBorders>
+              <w:top w:val="single" w:sz="4" w:space="0" w:color="AEC6D8"/>
+              <w:left w:val="single" w:sz="4" w:space="0" w:color="AEC6D8"/>
+              <w:bottom w:val="single" w:sz="4" w:space="0" w:color="AEC6D8"/>
+              <w:right w:val="single" w:sz="4" w:space="0" w:color="AEC6D8"/>
+            </w:tcBorders>
+            <w:shd w:val="clear" w:color="auto" w:fill="FFFFFF"/>
+            <w:tcMar>
+              <w:top w:w="70" w:type="dxa"/>
+              <w:left w:w="140" w:type="dxa"/>
+              <w:bottom w:w="70" w:type="dxa"/>
+              <w:right w:w="140" w:type="dxa"/>
+            </w:tcMar>
+            <w:vAlign w:val="center"/>
+          </w:tcPr>
+          <w:p>
+            <w:r>
+              <w:rPr>
+                <w:sz w:val="19"/>
+                <w:szCs w:val="19"/>
+              </w:rPr>
+              <w:t xml:space="preserve">Priorizar — carregando</w:t>
+            </w:r>
+          </w:p>
+        </w:tc>
+        <w:tc>
+          <w:tcPr>
+            <w:tcW w:w="4760" w:type="dxa"/>
+            <w:tcBorders>
+              <w:top w:val="single" w:sz="4" w:space="0" w:color="AEC6D8"/>
+              <w:left w:val="single" w:sz="4" w:space="0" w:color="AEC6D8"/>
+              <w:bottom w:val="single" w:sz="4" w:space="0" w:color="AEC6D8"/>
+              <w:right w:val="single" w:sz="4" w:space="0" w:color="AEC6D8"/>
+            </w:tcBorders>
+            <w:shd w:val="clear" w:color="auto" w:fill="FFFFFF"/>
+            <w:tcMar>
+              <w:top w:w="70" w:type="dxa"/>
+              <w:left w:w="140" w:type="dxa"/>
+              <w:bottom w:w="70" w:type="dxa"/>
+              <w:right w:w="140" w:type="dxa"/>
+            </w:tcMar>
+            <w:vAlign w:val="center"/>
+          </w:tcPr>
+          <w:p>
+            <w:r>
+              <w:rPr>
+                <w:sz w:val="19"/>
+                <w:szCs w:val="19"/>
+              </w:rPr>
+              <w:t xml:space="preserve">Sincroniza pendências e aguarda as sugestões (até 5 s — RNF-15).</w:t>
+            </w:r>
+          </w:p>
+        </w:tc>
+      </w:tr>
+      <w:tr>
+        <w:tblPrEx>
+          <w:tblCellMar>
+            <w:top w:w="0" w:type="dxa"/>
+            <w:bottom w:w="0" w:type="dxa"/>
+          </w:tblCellMar>
+        </w:tblPrEx>
+        <w:tc>
+          <w:tcPr>
+            <w:tcW w:w="2200" w:type="dxa"/>
+            <w:tcBorders>
+              <w:top w:val="single" w:sz="4" w:space="0" w:color="AEC6D8"/>
+              <w:left w:val="single" w:sz="4" w:space="0" w:color="AEC6D8"/>
+              <w:bottom w:val="single" w:sz="4" w:space="0" w:color="AEC6D8"/>
+              <w:right w:val="single" w:sz="4" w:space="0" w:color="AEC6D8"/>
+            </w:tcBorders>
+            <w:shd w:val="clear" w:color="auto" w:fill="EBF3FA"/>
+            <w:tcMar>
+              <w:top w:w="70" w:type="dxa"/>
+              <w:left w:w="140" w:type="dxa"/>
+              <w:bottom w:w="70" w:type="dxa"/>
+              <w:right w:w="140" w:type="dxa"/>
+            </w:tcMar>
+            <w:vAlign w:val="center"/>
+          </w:tcPr>
+          <w:p>
+            <w:r>
+              <w:rPr>
+                <w:sz w:val="19"/>
+                <w:szCs w:val="19"/>
+              </w:rPr>
+              <w:t xml:space="preserve">4</w:t>
+            </w:r>
+          </w:p>
+        </w:tc>
+        <w:tc>
+          <w:tcPr>
+            <w:tcW w:w="2400" w:type="dxa"/>
+            <w:tcBorders>
+              <w:top w:val="single" w:sz="4" w:space="0" w:color="AEC6D8"/>
+              <w:left w:val="single" w:sz="4" w:space="0" w:color="AEC6D8"/>
+              <w:bottom w:val="single" w:sz="4" w:space="0" w:color="AEC6D8"/>
+              <w:right w:val="single" w:sz="4" w:space="0" w:color="AEC6D8"/>
+            </w:tcBorders>
+            <w:shd w:val="clear" w:color="auto" w:fill="EBF3FA"/>
+            <w:tcMar>
+              <w:top w:w="70" w:type="dxa"/>
+              <w:left w:w="140" w:type="dxa"/>
+              <w:bottom w:w="70" w:type="dxa"/>
+              <w:right w:w="140" w:type="dxa"/>
+            </w:tcMar>
+            <w:vAlign w:val="center"/>
+          </w:tcPr>
+          <w:p>
+            <w:r>
+              <w:rPr>
+                <w:sz w:val="19"/>
+                <w:szCs w:val="19"/>
+              </w:rPr>
+              <w:t xml:space="preserve">Priorizar — cards</w:t>
+            </w:r>
+          </w:p>
+        </w:tc>
+        <w:tc>
+          <w:tcPr>
+            <w:tcW w:w="4760" w:type="dxa"/>
+            <w:tcBorders>
+              <w:top w:val="single" w:sz="4" w:space="0" w:color="AEC6D8"/>
+              <w:left w:val="single" w:sz="4" w:space="0" w:color="AEC6D8"/>
+              <w:bottom w:val="single" w:sz="4" w:space="0" w:color="AEC6D8"/>
+              <w:right w:val="single" w:sz="4" w:space="0" w:color="AEC6D8"/>
+            </w:tcBorders>
+            <w:shd w:val="clear" w:color="auto" w:fill="EBF3FA"/>
+            <w:tcMar>
+              <w:top w:w="70" w:type="dxa"/>
+              <w:left w:w="140" w:type="dxa"/>
+              <w:bottom w:w="70" w:type="dxa"/>
+              <w:right w:w="140" w:type="dxa"/>
+            </w:tcMar>
+            <w:vAlign w:val="center"/>
+          </w:tcPr>
+          <w:p>
+            <w:r>
+              <w:rPr>
+                <w:sz w:val="19"/>
+                <w:szCs w:val="19"/>
+              </w:rPr>
+              <w:t xml:space="preserve">Um card por tarefa com a sugestão da IA. → aceita, ← abre o seletor de quadrante, ↑ Fazer agora; botões equivalentes e desfazer.</w:t>
+            </w:r>
+          </w:p>
+        </w:tc>
+      </w:tr>
+      <w:tr>
+        <w:tblPrEx>
+          <w:tblCellMar>
+            <w:top w:w="0" w:type="dxa"/>
+            <w:bottom w:w="0" w:type="dxa"/>
+          </w:tblCellMar>
+        </w:tblPrEx>
+        <w:tc>
+          <w:tcPr>
+            <w:tcW w:w="2200" w:type="dxa"/>
+            <w:tcBorders>
+              <w:top w:val="single" w:sz="4" w:space="0" w:color="AEC6D8"/>
+              <w:left w:val="single" w:sz="4" w:space="0" w:color="AEC6D8"/>
+              <w:bottom w:val="single" w:sz="4" w:space="0" w:color="AEC6D8"/>
+              <w:right w:val="single" w:sz="4" w:space="0" w:color="AEC6D8"/>
+            </w:tcBorders>
+            <w:shd w:val="clear" w:color="auto" w:fill="FFFFFF"/>
+            <w:tcMar>
+              <w:top w:w="70" w:type="dxa"/>
+              <w:left w:w="140" w:type="dxa"/>
+              <w:bottom w:w="70" w:type="dxa"/>
+              <w:right w:w="140" w:type="dxa"/>
+            </w:tcMar>
+            <w:vAlign w:val="center"/>
+          </w:tcPr>
+          <w:p>
+            <w:r>
+              <w:rPr>
+                <w:sz w:val="19"/>
+                <w:szCs w:val="19"/>
+              </w:rPr>
+              <w:t xml:space="preserve">5</w:t>
+            </w:r>
+          </w:p>
+        </w:tc>
+        <w:tc>
+          <w:tcPr>
+            <w:tcW w:w="2400" w:type="dxa"/>
+            <w:tcBorders>
+              <w:top w:val="single" w:sz="4" w:space="0" w:color="AEC6D8"/>
+              <w:left w:val="single" w:sz="4" w:space="0" w:color="AEC6D8"/>
+              <w:bottom w:val="single" w:sz="4" w:space="0" w:color="AEC6D8"/>
+              <w:right w:val="single" w:sz="4" w:space="0" w:color="AEC6D8"/>
+            </w:tcBorders>
+            <w:shd w:val="clear" w:color="auto" w:fill="FFFFFF"/>
+            <w:tcMar>
+              <w:top w:w="70" w:type="dxa"/>
+              <w:left w:w="140" w:type="dxa"/>
+              <w:bottom w:w="70" w:type="dxa"/>
+              <w:right w:w="140" w:type="dxa"/>
+            </w:tcMar>
+            <w:vAlign w:val="center"/>
+          </w:tcPr>
+          <w:p>
+            <w:r>
+              <w:rPr>
+                <w:sz w:val="19"/>
+                <w:szCs w:val="19"/>
+              </w:rPr>
+              <w:t xml:space="preserve">Seletor de quadrante</w:t>
+            </w:r>
+          </w:p>
+        </w:tc>
+        <w:tc>
+          <w:tcPr>
+            <w:tcW w:w="4760" w:type="dxa"/>
+            <w:tcBorders>
+              <w:top w:val="single" w:sz="4" w:space="0" w:color="AEC6D8"/>
+              <w:left w:val="single" w:sz="4" w:space="0" w:color="AEC6D8"/>
+              <w:bottom w:val="single" w:sz="4" w:space="0" w:color="AEC6D8"/>
+              <w:right w:val="single" w:sz="4" w:space="0" w:color="AEC6D8"/>
+            </w:tcBorders>
+            <w:shd w:val="clear" w:color="auto" w:fill="FFFFFF"/>
+            <w:tcMar>
+              <w:top w:w="70" w:type="dxa"/>
+              <w:left w:w="140" w:type="dxa"/>
+              <w:bottom w:w="70" w:type="dxa"/>
+              <w:right w:w="140" w:type="dxa"/>
+            </w:tcMar>
+            <w:vAlign w:val="center"/>
+          </w:tcPr>
+          <w:p>
+            <w:r>
+              <w:rPr>
+                <w:sz w:val="19"/>
+                <w:szCs w:val="19"/>
+              </w:rPr>
+              <w:t xml:space="preserve">Quatro blocos (Fazer agora, Agendar, Delegar/Reduzir, Eliminar) ao rejeitar uma sugestão.</w:t>
+            </w:r>
+          </w:p>
+        </w:tc>
+      </w:tr>
+      <w:tr>
+        <w:tblPrEx>
+          <w:tblCellMar>
+            <w:top w:w="0" w:type="dxa"/>
+            <w:bottom w:w="0" w:type="dxa"/>
+          </w:tblCellMar>
+        </w:tblPrEx>
+        <w:tc>
+          <w:tcPr>
+            <w:tcW w:w="2200" w:type="dxa"/>
+            <w:tcBorders>
+              <w:top w:val="single" w:sz="4" w:space="0" w:color="AEC6D8"/>
+              <w:left w:val="single" w:sz="4" w:space="0" w:color="AEC6D8"/>
+              <w:bottom w:val="single" w:sz="4" w:space="0" w:color="AEC6D8"/>
+              <w:right w:val="single" w:sz="4" w:space="0" w:color="AEC6D8"/>
+            </w:tcBorders>
+            <w:shd w:val="clear" w:color="auto" w:fill="EBF3FA"/>
+            <w:tcMar>
+              <w:top w:w="70" w:type="dxa"/>
+              <w:left w:w="140" w:type="dxa"/>
+              <w:bottom w:w="70" w:type="dxa"/>
+              <w:right w:w="140" w:type="dxa"/>
+            </w:tcMar>
+            <w:vAlign w:val="center"/>
+          </w:tcPr>
+          <w:p>
+            <w:r>
+              <w:rPr>
+                <w:sz w:val="19"/>
+                <w:szCs w:val="19"/>
+              </w:rPr>
+              <w:t xml:space="preserve">6</w:t>
+            </w:r>
+          </w:p>
+        </w:tc>
+        <w:tc>
+          <w:tcPr>
+            <w:tcW w:w="2400" w:type="dxa"/>
+            <w:tcBorders>
+              <w:top w:val="single" w:sz="4" w:space="0" w:color="AEC6D8"/>
+              <w:left w:val="single" w:sz="4" w:space="0" w:color="AEC6D8"/>
+              <w:bottom w:val="single" w:sz="4" w:space="0" w:color="AEC6D8"/>
+              <w:right w:val="single" w:sz="4" w:space="0" w:color="AEC6D8"/>
+            </w:tcBorders>
+            <w:shd w:val="clear" w:color="auto" w:fill="EBF3FA"/>
+            <w:tcMar>
+              <w:top w:w="70" w:type="dxa"/>
+              <w:left w:w="140" w:type="dxa"/>
+              <w:bottom w:w="70" w:type="dxa"/>
+              <w:right w:w="140" w:type="dxa"/>
+            </w:tcMar>
+            <w:vAlign w:val="center"/>
+          </w:tcPr>
+          <w:p>
+            <w:r>
+              <w:rPr>
+                <w:sz w:val="19"/>
+                <w:szCs w:val="19"/>
+              </w:rPr>
+              <w:t xml:space="preserve">Resultado — matriz 2×2</w:t>
+            </w:r>
+          </w:p>
+        </w:tc>
+        <w:tc>
+          <w:tcPr>
+            <w:tcW w:w="4760" w:type="dxa"/>
+            <w:tcBorders>
+              <w:top w:val="single" w:sz="4" w:space="0" w:color="AEC6D8"/>
+              <w:left w:val="single" w:sz="4" w:space="0" w:color="AEC6D8"/>
+              <w:bottom w:val="single" w:sz="4" w:space="0" w:color="AEC6D8"/>
+              <w:right w:val="single" w:sz="4" w:space="0" w:color="AEC6D8"/>
+            </w:tcBorders>
+            <w:shd w:val="clear" w:color="auto" w:fill="EBF3FA"/>
+            <w:tcMar>
+              <w:top w:w="70" w:type="dxa"/>
+              <w:left w:w="140" w:type="dxa"/>
+              <w:bottom w:w="70" w:type="dxa"/>
+              <w:right w:w="140" w:type="dxa"/>
+            </w:tcMar>
+            <w:vAlign w:val="center"/>
+          </w:tcPr>
+          <w:p>
+            <w:r>
+              <w:rPr>
+                <w:sz w:val="19"/>
+                <w:szCs w:val="19"/>
+              </w:rPr>
+              <w:t xml:space="preserve">Tarefas distribuídas nos quadrantes; Aplicar, voltar para revisar ou descartar.</w:t>
+            </w:r>
+          </w:p>
+        </w:tc>
+      </w:tr>
+      <w:tr>
+        <w:tblPrEx>
+          <w:tblCellMar>
+            <w:top w:w="0" w:type="dxa"/>
+            <w:bottom w:w="0" w:type="dxa"/>
+          </w:tblCellMar>
+        </w:tblPrEx>
+        <w:tc>
+          <w:tcPr>
+            <w:tcW w:w="2200" w:type="dxa"/>
+            <w:tcBorders>
+              <w:top w:val="single" w:sz="4" w:space="0" w:color="AEC6D8"/>
+              <w:left w:val="single" w:sz="4" w:space="0" w:color="AEC6D8"/>
+              <w:bottom w:val="single" w:sz="4" w:space="0" w:color="AEC6D8"/>
+              <w:right w:val="single" w:sz="4" w:space="0" w:color="AEC6D8"/>
+            </w:tcBorders>
+            <w:shd w:val="clear" w:color="auto" w:fill="FFFFFF"/>
+            <w:tcMar>
+              <w:top w:w="70" w:type="dxa"/>
+              <w:left w:w="140" w:type="dxa"/>
+              <w:bottom w:w="70" w:type="dxa"/>
+              <w:right w:w="140" w:type="dxa"/>
+            </w:tcMar>
+            <w:vAlign w:val="center"/>
+          </w:tcPr>
+          <w:p>
+            <w:r>
+              <w:rPr>
+                <w:sz w:val="19"/>
+                <w:szCs w:val="19"/>
+              </w:rPr>
+              <w:t xml:space="preserve">7</w:t>
+            </w:r>
+          </w:p>
+        </w:tc>
+        <w:tc>
+          <w:tcPr>
+            <w:tcW w:w="2400" w:type="dxa"/>
+            <w:tcBorders>
+              <w:top w:val="single" w:sz="4" w:space="0" w:color="AEC6D8"/>
+              <w:left w:val="single" w:sz="4" w:space="0" w:color="AEC6D8"/>
+              <w:bottom w:val="single" w:sz="4" w:space="0" w:color="AEC6D8"/>
+              <w:right w:val="single" w:sz="4" w:space="0" w:color="AEC6D8"/>
+            </w:tcBorders>
+            <w:shd w:val="clear" w:color="auto" w:fill="FFFFFF"/>
+            <w:tcMar>
+              <w:top w:w="70" w:type="dxa"/>
+              <w:left w:w="140" w:type="dxa"/>
+              <w:bottom w:w="70" w:type="dxa"/>
+              <w:right w:w="140" w:type="dxa"/>
+            </w:tcMar>
+            <w:vAlign w:val="center"/>
+          </w:tcPr>
+          <w:p>
+            <w:r>
+              <w:rPr>
+                <w:sz w:val="19"/>
+                <w:szCs w:val="19"/>
+              </w:rPr>
+              <w:t xml:space="preserve">Timer</w:t>
+            </w:r>
+          </w:p>
+        </w:tc>
+        <w:tc>
+          <w:tcPr>
+            <w:tcW w:w="4760" w:type="dxa"/>
+            <w:tcBorders>
+              <w:top w:val="single" w:sz="4" w:space="0" w:color="AEC6D8"/>
+              <w:left w:val="single" w:sz="4" w:space="0" w:color="AEC6D8"/>
+              <w:bottom w:val="single" w:sz="4" w:space="0" w:color="AEC6D8"/>
+              <w:right w:val="single" w:sz="4" w:space="0" w:color="AEC6D8"/>
+            </w:tcBorders>
+            <w:shd w:val="clear" w:color="auto" w:fill="FFFFFF"/>
+            <w:tcMar>
+              <w:top w:w="70" w:type="dxa"/>
+              <w:left w:w="140" w:type="dxa"/>
+              <w:bottom w:w="70" w:type="dxa"/>
+              <w:right w:w="140" w:type="dxa"/>
+            </w:tcMar>
+            <w:vAlign w:val="center"/>
+          </w:tcPr>
+          <w:p>
+            <w:r>
+              <w:rPr>
+                <w:sz w:val="19"/>
+                <w:szCs w:val="19"/>
+              </w:rPr>
+              <w:t xml:space="preserve">Opcional: "Iniciar foco" em uma tarefa de "Fazer agora" abre o Timer já com a tarefa selecionada (RF-39).</w:t>
             </w:r>
           </w:p>
         </w:tc>
@@ -11057,6 +13657,98 @@
               <w:bottom w:val="single" w:sz="4" w:space="0" w:color="AEC6D8"/>
               <w:right w:val="single" w:sz="4" w:space="0" w:color="AEC6D8"/>
             </w:tcBorders>
+            <w:shd w:val="clear" w:color="auto" w:fill="FFFFFF"/>
+            <w:tcMar>
+              <w:top w:w="70" w:type="dxa"/>
+              <w:left w:w="140" w:type="dxa"/>
+              <w:bottom w:w="70" w:type="dxa"/>
+              <w:right w:w="140" w:type="dxa"/>
+            </w:tcMar>
+            <w:vAlign w:val="center"/>
+          </w:tcPr>
+          <w:p>
+            <w:r>
+              <w:rPr>
+                <w:sz w:val="19"/>
+                <w:szCs w:val="19"/>
+              </w:rPr>
+              <w:t xml:space="preserve">quadrant</w:t>
+            </w:r>
+          </w:p>
+        </w:tc>
+        <w:tc>
+          <w:tcPr>
+            <w:tcW w:w="2200" w:type="dxa"/>
+            <w:tcBorders>
+              <w:top w:val="single" w:sz="4" w:space="0" w:color="AEC6D8"/>
+              <w:left w:val="single" w:sz="4" w:space="0" w:color="AEC6D8"/>
+              <w:bottom w:val="single" w:sz="4" w:space="0" w:color="AEC6D8"/>
+              <w:right w:val="single" w:sz="4" w:space="0" w:color="AEC6D8"/>
+            </w:tcBorders>
+            <w:shd w:val="clear" w:color="auto" w:fill="FFFFFF"/>
+            <w:tcMar>
+              <w:top w:w="70" w:type="dxa"/>
+              <w:left w:w="140" w:type="dxa"/>
+              <w:bottom w:w="70" w:type="dxa"/>
+              <w:right w:w="140" w:type="dxa"/>
+            </w:tcMar>
+            <w:vAlign w:val="center"/>
+          </w:tcPr>
+          <w:p>
+            <w:r>
+              <w:rPr>
+                <w:sz w:val="19"/>
+                <w:szCs w:val="19"/>
+              </w:rPr>
+              <w:t xml:space="preserve">enum (opcional)</w:t>
+            </w:r>
+          </w:p>
+        </w:tc>
+        <w:tc>
+          <w:tcPr>
+            <w:tcW w:w="4560" w:type="dxa"/>
+            <w:tcBorders>
+              <w:top w:val="single" w:sz="4" w:space="0" w:color="AEC6D8"/>
+              <w:left w:val="single" w:sz="4" w:space="0" w:color="AEC6D8"/>
+              <w:bottom w:val="single" w:sz="4" w:space="0" w:color="AEC6D8"/>
+              <w:right w:val="single" w:sz="4" w:space="0" w:color="AEC6D8"/>
+            </w:tcBorders>
+            <w:shd w:val="clear" w:color="auto" w:fill="FFFFFF"/>
+            <w:tcMar>
+              <w:top w:w="70" w:type="dxa"/>
+              <w:left w:w="140" w:type="dxa"/>
+              <w:bottom w:w="70" w:type="dxa"/>
+              <w:right w:w="140" w:type="dxa"/>
+            </w:tcMar>
+            <w:vAlign w:val="center"/>
+          </w:tcPr>
+          <w:p>
+            <w:r>
+              <w:rPr>
+                <w:sz w:val="19"/>
+                <w:szCs w:val="19"/>
+              </w:rPr>
+              <w:t xml:space="preserve">Quadrante de Eisenhower: do_now / schedule / delegate / eliminate (definido pela priorização com IA)</w:t>
+            </w:r>
+          </w:p>
+        </w:tc>
+      </w:tr>
+      <w:tr>
+        <w:tblPrEx>
+          <w:tblCellMar>
+            <w:top w:w="0" w:type="dxa"/>
+            <w:bottom w:w="0" w:type="dxa"/>
+          </w:tblCellMar>
+        </w:tblPrEx>
+        <w:tc>
+          <w:tcPr>
+            <w:tcW w:w="2600" w:type="dxa"/>
+            <w:tcBorders>
+              <w:top w:val="single" w:sz="4" w:space="0" w:color="AEC6D8"/>
+              <w:left w:val="single" w:sz="4" w:space="0" w:color="AEC6D8"/>
+              <w:bottom w:val="single" w:sz="4" w:space="0" w:color="AEC6D8"/>
+              <w:right w:val="single" w:sz="4" w:space="0" w:color="AEC6D8"/>
+            </w:tcBorders>
             <w:shd w:val="clear" w:color="auto" w:fill="EBF3FA"/>
             <w:tcMar>
               <w:top w:w="70" w:type="dxa"/>
@@ -12933,6 +15625,1068 @@
                 <w:szCs w:val="19"/>
               </w:rPr>
               <w:t xml:space="preserve">Data/hora de última atualização (usado pelo last-write-wins)</w:t>
+            </w:r>
+          </w:p>
+        </w:tc>
+      </w:tr>
+    </w:tbl>
+    <w:p>
+      <w:pPr>
+        <w:spacing w:before="200" w:after="80"/>
+      </w:pPr>
+      <w:r>
+        <w:rPr>
+          <w:b/>
+          <w:bCs/>
+          <w:color w:val="003366"/>
+          <w:sz w:val="22"/>
+          <w:szCs w:val="22"/>
+        </w:rPr>
+        <w:t xml:space="preserve">6.5 Tabelas PRIORITIZATION_SESSIONS e PRIORITIZATION_DECISIONS (somente no servidor)</w:t>
+      </w:r>
+    </w:p>
+    <w:tbl>
+      <w:tblPr>
+        <w:tblW w:w="9360" w:type="dxa"/>
+        <w:tblBorders>
+          <w:top w:val="single" w:sz="4" w:space="0" w:color="auto"/>
+          <w:left w:val="single" w:sz="4" w:space="0" w:color="auto"/>
+          <w:bottom w:val="single" w:sz="4" w:space="0" w:color="auto"/>
+          <w:right w:val="single" w:sz="4" w:space="0" w:color="auto"/>
+          <w:insideH w:val="single" w:sz="4" w:space="0" w:color="auto"/>
+          <w:insideV w:val="single" w:sz="4" w:space="0" w:color="auto"/>
+        </w:tblBorders>
+        <w:tblCellMar>
+          <w:left w:w="10" w:type="dxa"/>
+          <w:right w:w="10" w:type="dxa"/>
+        </w:tblCellMar>
+        <w:tblLook w:val="0000" w:firstRow="0" w:lastRow="0" w:firstColumn="0" w:lastColumn="0" w:noHBand="0" w:noVBand="0"/>
+      </w:tblPr>
+      <w:tblGrid>
+        <w:gridCol w:w="2600"/>
+        <w:gridCol w:w="2200"/>
+        <w:gridCol w:w="4560"/>
+      </w:tblGrid>
+      <w:tr>
+        <w:tblPrEx>
+          <w:tblCellMar>
+            <w:top w:w="0" w:type="dxa"/>
+            <w:bottom w:w="0" w:type="dxa"/>
+          </w:tblCellMar>
+        </w:tblPrEx>
+        <w:trPr>
+          <w:tblHeader/>
+        </w:trPr>
+        <w:tc>
+          <w:tcPr>
+            <w:tcW w:w="2600" w:type="dxa"/>
+            <w:tcBorders>
+              <w:top w:val="single" w:sz="4" w:space="0" w:color="AEC6D8"/>
+              <w:left w:val="single" w:sz="4" w:space="0" w:color="AEC6D8"/>
+              <w:bottom w:val="single" w:sz="4" w:space="0" w:color="AEC6D8"/>
+              <w:right w:val="single" w:sz="4" w:space="0" w:color="AEC6D8"/>
+            </w:tcBorders>
+            <w:shd w:val="clear" w:color="auto" w:fill="002855"/>
+            <w:tcMar>
+              <w:top w:w="80" w:type="dxa"/>
+              <w:left w:w="140" w:type="dxa"/>
+              <w:bottom w:w="80" w:type="dxa"/>
+              <w:right w:w="140" w:type="dxa"/>
+            </w:tcMar>
+            <w:vAlign w:val="center"/>
+          </w:tcPr>
+          <w:p>
+            <w:r>
+              <w:rPr>
+                <w:b/>
+                <w:bCs/>
+                <w:color w:val="FFFFFF"/>
+                <w:sz w:val="18"/>
+                <w:szCs w:val="18"/>
+              </w:rPr>
+              <w:t>Campo</w:t>
+            </w:r>
+          </w:p>
+        </w:tc>
+        <w:tc>
+          <w:tcPr>
+            <w:tcW w:w="2200" w:type="dxa"/>
+            <w:tcBorders>
+              <w:top w:val="single" w:sz="4" w:space="0" w:color="AEC6D8"/>
+              <w:left w:val="single" w:sz="4" w:space="0" w:color="AEC6D8"/>
+              <w:bottom w:val="single" w:sz="4" w:space="0" w:color="AEC6D8"/>
+              <w:right w:val="single" w:sz="4" w:space="0" w:color="AEC6D8"/>
+            </w:tcBorders>
+            <w:shd w:val="clear" w:color="auto" w:fill="002855"/>
+            <w:tcMar>
+              <w:top w:w="80" w:type="dxa"/>
+              <w:left w:w="140" w:type="dxa"/>
+              <w:bottom w:w="80" w:type="dxa"/>
+              <w:right w:w="140" w:type="dxa"/>
+            </w:tcMar>
+            <w:vAlign w:val="center"/>
+          </w:tcPr>
+          <w:p>
+            <w:r>
+              <w:rPr>
+                <w:b/>
+                <w:bCs/>
+                <w:color w:val="FFFFFF"/>
+                <w:sz w:val="18"/>
+                <w:szCs w:val="18"/>
+              </w:rPr>
+              <w:t>Tipo</w:t>
+            </w:r>
+          </w:p>
+        </w:tc>
+        <w:tc>
+          <w:tcPr>
+            <w:tcW w:w="4560" w:type="dxa"/>
+            <w:tcBorders>
+              <w:top w:val="single" w:sz="4" w:space="0" w:color="AEC6D8"/>
+              <w:left w:val="single" w:sz="4" w:space="0" w:color="AEC6D8"/>
+              <w:bottom w:val="single" w:sz="4" w:space="0" w:color="AEC6D8"/>
+              <w:right w:val="single" w:sz="4" w:space="0" w:color="AEC6D8"/>
+            </w:tcBorders>
+            <w:shd w:val="clear" w:color="auto" w:fill="002855"/>
+            <w:tcMar>
+              <w:top w:w="80" w:type="dxa"/>
+              <w:left w:w="140" w:type="dxa"/>
+              <w:bottom w:w="80" w:type="dxa"/>
+              <w:right w:w="140" w:type="dxa"/>
+            </w:tcMar>
+            <w:vAlign w:val="center"/>
+          </w:tcPr>
+          <w:p>
+            <w:r>
+              <w:rPr>
+                <w:b/>
+                <w:bCs/>
+                <w:color w:val="FFFFFF"/>
+                <w:sz w:val="18"/>
+                <w:szCs w:val="18"/>
+              </w:rPr>
+              <w:t>Descrição</w:t>
+            </w:r>
+          </w:p>
+        </w:tc>
+      </w:tr>
+      <w:tr>
+        <w:tblPrEx>
+          <w:tblCellMar>
+            <w:top w:w="0" w:type="dxa"/>
+            <w:bottom w:w="0" w:type="dxa"/>
+          </w:tblCellMar>
+        </w:tblPrEx>
+        <w:tc>
+          <w:tcPr>
+            <w:tcW w:w="2600" w:type="dxa"/>
+            <w:tcBorders>
+              <w:top w:val="single" w:sz="4" w:space="0" w:color="AEC6D8"/>
+              <w:left w:val="single" w:sz="4" w:space="0" w:color="AEC6D8"/>
+              <w:bottom w:val="single" w:sz="4" w:space="0" w:color="AEC6D8"/>
+              <w:right w:val="single" w:sz="4" w:space="0" w:color="AEC6D8"/>
+            </w:tcBorders>
+            <w:shd w:val="clear" w:color="auto" w:fill="FFFFFF"/>
+            <w:tcMar>
+              <w:top w:w="70" w:type="dxa"/>
+              <w:left w:w="140" w:type="dxa"/>
+              <w:bottom w:w="70" w:type="dxa"/>
+              <w:right w:w="140" w:type="dxa"/>
+            </w:tcMar>
+            <w:vAlign w:val="center"/>
+          </w:tcPr>
+          <w:p>
+            <w:r>
+              <w:rPr>
+                <w:sz w:val="19"/>
+                <w:szCs w:val="19"/>
+              </w:rPr>
+              <w:t xml:space="preserve">prioritization_sessions.id</w:t>
+            </w:r>
+          </w:p>
+        </w:tc>
+        <w:tc>
+          <w:tcPr>
+            <w:tcW w:w="2200" w:type="dxa"/>
+            <w:tcBorders>
+              <w:top w:val="single" w:sz="4" w:space="0" w:color="AEC6D8"/>
+              <w:left w:val="single" w:sz="4" w:space="0" w:color="AEC6D8"/>
+              <w:bottom w:val="single" w:sz="4" w:space="0" w:color="AEC6D8"/>
+              <w:right w:val="single" w:sz="4" w:space="0" w:color="AEC6D8"/>
+            </w:tcBorders>
+            <w:shd w:val="clear" w:color="auto" w:fill="FFFFFF"/>
+            <w:tcMar>
+              <w:top w:w="70" w:type="dxa"/>
+              <w:left w:w="140" w:type="dxa"/>
+              <w:bottom w:w="70" w:type="dxa"/>
+              <w:right w:w="140" w:type="dxa"/>
+            </w:tcMar>
+            <w:vAlign w:val="center"/>
+          </w:tcPr>
+          <w:p>
+            <w:r>
+              <w:rPr>
+                <w:sz w:val="19"/>
+                <w:szCs w:val="19"/>
+              </w:rPr>
+              <w:t xml:space="preserve">uuid (PK)</w:t>
+            </w:r>
+          </w:p>
+        </w:tc>
+        <w:tc>
+          <w:tcPr>
+            <w:tcW w:w="4560" w:type="dxa"/>
+            <w:tcBorders>
+              <w:top w:val="single" w:sz="4" w:space="0" w:color="AEC6D8"/>
+              <w:left w:val="single" w:sz="4" w:space="0" w:color="AEC6D8"/>
+              <w:bottom w:val="single" w:sz="4" w:space="0" w:color="AEC6D8"/>
+              <w:right w:val="single" w:sz="4" w:space="0" w:color="AEC6D8"/>
+            </w:tcBorders>
+            <w:shd w:val="clear" w:color="auto" w:fill="FFFFFF"/>
+            <w:tcMar>
+              <w:top w:w="70" w:type="dxa"/>
+              <w:left w:w="140" w:type="dxa"/>
+              <w:bottom w:w="70" w:type="dxa"/>
+              <w:right w:w="140" w:type="dxa"/>
+            </w:tcMar>
+            <w:vAlign w:val="center"/>
+          </w:tcPr>
+          <w:p>
+            <w:r>
+              <w:rPr>
+                <w:sz w:val="19"/>
+                <w:szCs w:val="19"/>
+              </w:rPr>
+              <w:t xml:space="preserve">Sessão de priorização</w:t>
+            </w:r>
+          </w:p>
+        </w:tc>
+      </w:tr>
+      <w:tr>
+        <w:tblPrEx>
+          <w:tblCellMar>
+            <w:top w:w="0" w:type="dxa"/>
+            <w:bottom w:w="0" w:type="dxa"/>
+          </w:tblCellMar>
+        </w:tblPrEx>
+        <w:tc>
+          <w:tcPr>
+            <w:tcW w:w="2600" w:type="dxa"/>
+            <w:tcBorders>
+              <w:top w:val="single" w:sz="4" w:space="0" w:color="AEC6D8"/>
+              <w:left w:val="single" w:sz="4" w:space="0" w:color="AEC6D8"/>
+              <w:bottom w:val="single" w:sz="4" w:space="0" w:color="AEC6D8"/>
+              <w:right w:val="single" w:sz="4" w:space="0" w:color="AEC6D8"/>
+            </w:tcBorders>
+            <w:shd w:val="clear" w:color="auto" w:fill="EBF3FA"/>
+            <w:tcMar>
+              <w:top w:w="70" w:type="dxa"/>
+              <w:left w:w="140" w:type="dxa"/>
+              <w:bottom w:w="70" w:type="dxa"/>
+              <w:right w:w="140" w:type="dxa"/>
+            </w:tcMar>
+            <w:vAlign w:val="center"/>
+          </w:tcPr>
+          <w:p>
+            <w:r>
+              <w:rPr>
+                <w:sz w:val="19"/>
+                <w:szCs w:val="19"/>
+              </w:rPr>
+              <w:t xml:space="preserve">prioritization_sessions.user_id</w:t>
+            </w:r>
+          </w:p>
+        </w:tc>
+        <w:tc>
+          <w:tcPr>
+            <w:tcW w:w="2200" w:type="dxa"/>
+            <w:tcBorders>
+              <w:top w:val="single" w:sz="4" w:space="0" w:color="AEC6D8"/>
+              <w:left w:val="single" w:sz="4" w:space="0" w:color="AEC6D8"/>
+              <w:bottom w:val="single" w:sz="4" w:space="0" w:color="AEC6D8"/>
+              <w:right w:val="single" w:sz="4" w:space="0" w:color="AEC6D8"/>
+            </w:tcBorders>
+            <w:shd w:val="clear" w:color="auto" w:fill="EBF3FA"/>
+            <w:tcMar>
+              <w:top w:w="70" w:type="dxa"/>
+              <w:left w:w="140" w:type="dxa"/>
+              <w:bottom w:w="70" w:type="dxa"/>
+              <w:right w:w="140" w:type="dxa"/>
+            </w:tcMar>
+            <w:vAlign w:val="center"/>
+          </w:tcPr>
+          <w:p>
+            <w:r>
+              <w:rPr>
+                <w:sz w:val="19"/>
+                <w:szCs w:val="19"/>
+              </w:rPr>
+              <w:t xml:space="preserve">uuid (FK → users.id)</w:t>
+            </w:r>
+          </w:p>
+        </w:tc>
+        <w:tc>
+          <w:tcPr>
+            <w:tcW w:w="4560" w:type="dxa"/>
+            <w:tcBorders>
+              <w:top w:val="single" w:sz="4" w:space="0" w:color="AEC6D8"/>
+              <w:left w:val="single" w:sz="4" w:space="0" w:color="AEC6D8"/>
+              <w:bottom w:val="single" w:sz="4" w:space="0" w:color="AEC6D8"/>
+              <w:right w:val="single" w:sz="4" w:space="0" w:color="AEC6D8"/>
+            </w:tcBorders>
+            <w:shd w:val="clear" w:color="auto" w:fill="EBF3FA"/>
+            <w:tcMar>
+              <w:top w:w="70" w:type="dxa"/>
+              <w:left w:w="140" w:type="dxa"/>
+              <w:bottom w:w="70" w:type="dxa"/>
+              <w:right w:w="140" w:type="dxa"/>
+            </w:tcMar>
+            <w:vAlign w:val="center"/>
+          </w:tcPr>
+          <w:p>
+            <w:r>
+              <w:rPr>
+                <w:sz w:val="19"/>
+                <w:szCs w:val="19"/>
+              </w:rPr>
+              <w:t xml:space="preserve">Dono da sessão</w:t>
+            </w:r>
+          </w:p>
+        </w:tc>
+      </w:tr>
+      <w:tr>
+        <w:tblPrEx>
+          <w:tblCellMar>
+            <w:top w:w="0" w:type="dxa"/>
+            <w:bottom w:w="0" w:type="dxa"/>
+          </w:tblCellMar>
+        </w:tblPrEx>
+        <w:tc>
+          <w:tcPr>
+            <w:tcW w:w="2600" w:type="dxa"/>
+            <w:tcBorders>
+              <w:top w:val="single" w:sz="4" w:space="0" w:color="AEC6D8"/>
+              <w:left w:val="single" w:sz="4" w:space="0" w:color="AEC6D8"/>
+              <w:bottom w:val="single" w:sz="4" w:space="0" w:color="AEC6D8"/>
+              <w:right w:val="single" w:sz="4" w:space="0" w:color="AEC6D8"/>
+            </w:tcBorders>
+            <w:shd w:val="clear" w:color="auto" w:fill="FFFFFF"/>
+            <w:tcMar>
+              <w:top w:w="70" w:type="dxa"/>
+              <w:left w:w="140" w:type="dxa"/>
+              <w:bottom w:w="70" w:type="dxa"/>
+              <w:right w:w="140" w:type="dxa"/>
+            </w:tcMar>
+            <w:vAlign w:val="center"/>
+          </w:tcPr>
+          <w:p>
+            <w:r>
+              <w:rPr>
+                <w:sz w:val="19"/>
+                <w:szCs w:val="19"/>
+              </w:rPr>
+              <w:t xml:space="preserve">prioritization_sessions.status</w:t>
+            </w:r>
+          </w:p>
+        </w:tc>
+        <w:tc>
+          <w:tcPr>
+            <w:tcW w:w="2200" w:type="dxa"/>
+            <w:tcBorders>
+              <w:top w:val="single" w:sz="4" w:space="0" w:color="AEC6D8"/>
+              <w:left w:val="single" w:sz="4" w:space="0" w:color="AEC6D8"/>
+              <w:bottom w:val="single" w:sz="4" w:space="0" w:color="AEC6D8"/>
+              <w:right w:val="single" w:sz="4" w:space="0" w:color="AEC6D8"/>
+            </w:tcBorders>
+            <w:shd w:val="clear" w:color="auto" w:fill="FFFFFF"/>
+            <w:tcMar>
+              <w:top w:w="70" w:type="dxa"/>
+              <w:left w:w="140" w:type="dxa"/>
+              <w:bottom w:w="70" w:type="dxa"/>
+              <w:right w:w="140" w:type="dxa"/>
+            </w:tcMar>
+            <w:vAlign w:val="center"/>
+          </w:tcPr>
+          <w:p>
+            <w:r>
+              <w:rPr>
+                <w:sz w:val="19"/>
+                <w:szCs w:val="19"/>
+              </w:rPr>
+              <w:t xml:space="preserve">enum</w:t>
+            </w:r>
+          </w:p>
+        </w:tc>
+        <w:tc>
+          <w:tcPr>
+            <w:tcW w:w="4560" w:type="dxa"/>
+            <w:tcBorders>
+              <w:top w:val="single" w:sz="4" w:space="0" w:color="AEC6D8"/>
+              <w:left w:val="single" w:sz="4" w:space="0" w:color="AEC6D8"/>
+              <w:bottom w:val="single" w:sz="4" w:space="0" w:color="AEC6D8"/>
+              <w:right w:val="single" w:sz="4" w:space="0" w:color="AEC6D8"/>
+            </w:tcBorders>
+            <w:shd w:val="clear" w:color="auto" w:fill="FFFFFF"/>
+            <w:tcMar>
+              <w:top w:w="70" w:type="dxa"/>
+              <w:left w:w="140" w:type="dxa"/>
+              <w:bottom w:w="70" w:type="dxa"/>
+              <w:right w:w="140" w:type="dxa"/>
+            </w:tcMar>
+            <w:vAlign w:val="center"/>
+          </w:tcPr>
+          <w:p>
+            <w:r>
+              <w:rPr>
+                <w:sz w:val="19"/>
+                <w:szCs w:val="19"/>
+              </w:rPr>
+              <w:t xml:space="preserve">open / applied / abandoned</w:t>
+            </w:r>
+          </w:p>
+        </w:tc>
+      </w:tr>
+      <w:tr>
+        <w:tblPrEx>
+          <w:tblCellMar>
+            <w:top w:w="0" w:type="dxa"/>
+            <w:bottom w:w="0" w:type="dxa"/>
+          </w:tblCellMar>
+        </w:tblPrEx>
+        <w:tc>
+          <w:tcPr>
+            <w:tcW w:w="2600" w:type="dxa"/>
+            <w:tcBorders>
+              <w:top w:val="single" w:sz="4" w:space="0" w:color="AEC6D8"/>
+              <w:left w:val="single" w:sz="4" w:space="0" w:color="AEC6D8"/>
+              <w:bottom w:val="single" w:sz="4" w:space="0" w:color="AEC6D8"/>
+              <w:right w:val="single" w:sz="4" w:space="0" w:color="AEC6D8"/>
+            </w:tcBorders>
+            <w:shd w:val="clear" w:color="auto" w:fill="EBF3FA"/>
+            <w:tcMar>
+              <w:top w:w="70" w:type="dxa"/>
+              <w:left w:w="140" w:type="dxa"/>
+              <w:bottom w:w="70" w:type="dxa"/>
+              <w:right w:w="140" w:type="dxa"/>
+            </w:tcMar>
+            <w:vAlign w:val="center"/>
+          </w:tcPr>
+          <w:p>
+            <w:r>
+              <w:rPr>
+                <w:sz w:val="19"/>
+                <w:szCs w:val="19"/>
+              </w:rPr>
+              <w:t xml:space="preserve">prioritization_sessions.started_at / finished_at</w:t>
+            </w:r>
+          </w:p>
+        </w:tc>
+        <w:tc>
+          <w:tcPr>
+            <w:tcW w:w="2200" w:type="dxa"/>
+            <w:tcBorders>
+              <w:top w:val="single" w:sz="4" w:space="0" w:color="AEC6D8"/>
+              <w:left w:val="single" w:sz="4" w:space="0" w:color="AEC6D8"/>
+              <w:bottom w:val="single" w:sz="4" w:space="0" w:color="AEC6D8"/>
+              <w:right w:val="single" w:sz="4" w:space="0" w:color="AEC6D8"/>
+            </w:tcBorders>
+            <w:shd w:val="clear" w:color="auto" w:fill="EBF3FA"/>
+            <w:tcMar>
+              <w:top w:w="70" w:type="dxa"/>
+              <w:left w:w="140" w:type="dxa"/>
+              <w:bottom w:w="70" w:type="dxa"/>
+              <w:right w:w="140" w:type="dxa"/>
+            </w:tcMar>
+            <w:vAlign w:val="center"/>
+          </w:tcPr>
+          <w:p>
+            <w:r>
+              <w:rPr>
+                <w:sz w:val="19"/>
+                <w:szCs w:val="19"/>
+              </w:rPr>
+              <w:t xml:space="preserve">timestamp</w:t>
+            </w:r>
+          </w:p>
+        </w:tc>
+        <w:tc>
+          <w:tcPr>
+            <w:tcW w:w="4560" w:type="dxa"/>
+            <w:tcBorders>
+              <w:top w:val="single" w:sz="4" w:space="0" w:color="AEC6D8"/>
+              <w:left w:val="single" w:sz="4" w:space="0" w:color="AEC6D8"/>
+              <w:bottom w:val="single" w:sz="4" w:space="0" w:color="AEC6D8"/>
+              <w:right w:val="single" w:sz="4" w:space="0" w:color="AEC6D8"/>
+            </w:tcBorders>
+            <w:shd w:val="clear" w:color="auto" w:fill="EBF3FA"/>
+            <w:tcMar>
+              <w:top w:w="70" w:type="dxa"/>
+              <w:left w:w="140" w:type="dxa"/>
+              <w:bottom w:w="70" w:type="dxa"/>
+              <w:right w:w="140" w:type="dxa"/>
+            </w:tcMar>
+            <w:vAlign w:val="center"/>
+          </w:tcPr>
+          <w:p>
+            <w:r>
+              <w:rPr>
+                <w:sz w:val="19"/>
+                <w:szCs w:val="19"/>
+              </w:rPr>
+              <w:t xml:space="preserve">Início e fim da sessão</w:t>
+            </w:r>
+          </w:p>
+        </w:tc>
+      </w:tr>
+      <w:tr>
+        <w:tblPrEx>
+          <w:tblCellMar>
+            <w:top w:w="0" w:type="dxa"/>
+            <w:bottom w:w="0" w:type="dxa"/>
+          </w:tblCellMar>
+        </w:tblPrEx>
+        <w:tc>
+          <w:tcPr>
+            <w:tcW w:w="2600" w:type="dxa"/>
+            <w:tcBorders>
+              <w:top w:val="single" w:sz="4" w:space="0" w:color="AEC6D8"/>
+              <w:left w:val="single" w:sz="4" w:space="0" w:color="AEC6D8"/>
+              <w:bottom w:val="single" w:sz="4" w:space="0" w:color="AEC6D8"/>
+              <w:right w:val="single" w:sz="4" w:space="0" w:color="AEC6D8"/>
+            </w:tcBorders>
+            <w:shd w:val="clear" w:color="auto" w:fill="FFFFFF"/>
+            <w:tcMar>
+              <w:top w:w="70" w:type="dxa"/>
+              <w:left w:w="140" w:type="dxa"/>
+              <w:bottom w:w="70" w:type="dxa"/>
+              <w:right w:w="140" w:type="dxa"/>
+            </w:tcMar>
+            <w:vAlign w:val="center"/>
+          </w:tcPr>
+          <w:p>
+            <w:r>
+              <w:rPr>
+                <w:sz w:val="19"/>
+                <w:szCs w:val="19"/>
+              </w:rPr>
+              <w:t xml:space="preserve">prioritization_decisions.session_id / task_id</w:t>
+            </w:r>
+          </w:p>
+        </w:tc>
+        <w:tc>
+          <w:tcPr>
+            <w:tcW w:w="2200" w:type="dxa"/>
+            <w:tcBorders>
+              <w:top w:val="single" w:sz="4" w:space="0" w:color="AEC6D8"/>
+              <w:left w:val="single" w:sz="4" w:space="0" w:color="AEC6D8"/>
+              <w:bottom w:val="single" w:sz="4" w:space="0" w:color="AEC6D8"/>
+              <w:right w:val="single" w:sz="4" w:space="0" w:color="AEC6D8"/>
+            </w:tcBorders>
+            <w:shd w:val="clear" w:color="auto" w:fill="FFFFFF"/>
+            <w:tcMar>
+              <w:top w:w="70" w:type="dxa"/>
+              <w:left w:w="140" w:type="dxa"/>
+              <w:bottom w:w="70" w:type="dxa"/>
+              <w:right w:w="140" w:type="dxa"/>
+            </w:tcMar>
+            <w:vAlign w:val="center"/>
+          </w:tcPr>
+          <w:p>
+            <w:r>
+              <w:rPr>
+                <w:sz w:val="19"/>
+                <w:szCs w:val="19"/>
+              </w:rPr>
+              <w:t xml:space="preserve">uuid (FK)</w:t>
+            </w:r>
+          </w:p>
+        </w:tc>
+        <w:tc>
+          <w:tcPr>
+            <w:tcW w:w="4560" w:type="dxa"/>
+            <w:tcBorders>
+              <w:top w:val="single" w:sz="4" w:space="0" w:color="AEC6D8"/>
+              <w:left w:val="single" w:sz="4" w:space="0" w:color="AEC6D8"/>
+              <w:bottom w:val="single" w:sz="4" w:space="0" w:color="AEC6D8"/>
+              <w:right w:val="single" w:sz="4" w:space="0" w:color="AEC6D8"/>
+            </w:tcBorders>
+            <w:shd w:val="clear" w:color="auto" w:fill="FFFFFF"/>
+            <w:tcMar>
+              <w:top w:w="70" w:type="dxa"/>
+              <w:left w:w="140" w:type="dxa"/>
+              <w:bottom w:w="70" w:type="dxa"/>
+              <w:right w:w="140" w:type="dxa"/>
+            </w:tcMar>
+            <w:vAlign w:val="center"/>
+          </w:tcPr>
+          <w:p>
+            <w:r>
+              <w:rPr>
+                <w:sz w:val="19"/>
+                <w:szCs w:val="19"/>
+              </w:rPr>
+              <w:t xml:space="preserve">Sessão e tarefa decididas</w:t>
+            </w:r>
+          </w:p>
+        </w:tc>
+      </w:tr>
+      <w:tr>
+        <w:tblPrEx>
+          <w:tblCellMar>
+            <w:top w:w="0" w:type="dxa"/>
+            <w:bottom w:w="0" w:type="dxa"/>
+          </w:tblCellMar>
+        </w:tblPrEx>
+        <w:tc>
+          <w:tcPr>
+            <w:tcW w:w="2600" w:type="dxa"/>
+            <w:tcBorders>
+              <w:top w:val="single" w:sz="4" w:space="0" w:color="AEC6D8"/>
+              <w:left w:val="single" w:sz="4" w:space="0" w:color="AEC6D8"/>
+              <w:bottom w:val="single" w:sz="4" w:space="0" w:color="AEC6D8"/>
+              <w:right w:val="single" w:sz="4" w:space="0" w:color="AEC6D8"/>
+            </w:tcBorders>
+            <w:shd w:val="clear" w:color="auto" w:fill="EBF3FA"/>
+            <w:tcMar>
+              <w:top w:w="70" w:type="dxa"/>
+              <w:left w:w="140" w:type="dxa"/>
+              <w:bottom w:w="70" w:type="dxa"/>
+              <w:right w:w="140" w:type="dxa"/>
+            </w:tcMar>
+            <w:vAlign w:val="center"/>
+          </w:tcPr>
+          <w:p>
+            <w:r>
+              <w:rPr>
+                <w:sz w:val="19"/>
+                <w:szCs w:val="19"/>
+              </w:rPr>
+              <w:t xml:space="preserve">prioritization_decisions.suggested_quadrant</w:t>
+            </w:r>
+          </w:p>
+        </w:tc>
+        <w:tc>
+          <w:tcPr>
+            <w:tcW w:w="2200" w:type="dxa"/>
+            <w:tcBorders>
+              <w:top w:val="single" w:sz="4" w:space="0" w:color="AEC6D8"/>
+              <w:left w:val="single" w:sz="4" w:space="0" w:color="AEC6D8"/>
+              <w:bottom w:val="single" w:sz="4" w:space="0" w:color="AEC6D8"/>
+              <w:right w:val="single" w:sz="4" w:space="0" w:color="AEC6D8"/>
+            </w:tcBorders>
+            <w:shd w:val="clear" w:color="auto" w:fill="EBF3FA"/>
+            <w:tcMar>
+              <w:top w:w="70" w:type="dxa"/>
+              <w:left w:w="140" w:type="dxa"/>
+              <w:bottom w:w="70" w:type="dxa"/>
+              <w:right w:w="140" w:type="dxa"/>
+            </w:tcMar>
+            <w:vAlign w:val="center"/>
+          </w:tcPr>
+          <w:p>
+            <w:r>
+              <w:rPr>
+                <w:sz w:val="19"/>
+                <w:szCs w:val="19"/>
+              </w:rPr>
+              <w:t xml:space="preserve">enum</w:t>
+            </w:r>
+          </w:p>
+        </w:tc>
+        <w:tc>
+          <w:tcPr>
+            <w:tcW w:w="4560" w:type="dxa"/>
+            <w:tcBorders>
+              <w:top w:val="single" w:sz="4" w:space="0" w:color="AEC6D8"/>
+              <w:left w:val="single" w:sz="4" w:space="0" w:color="AEC6D8"/>
+              <w:bottom w:val="single" w:sz="4" w:space="0" w:color="AEC6D8"/>
+              <w:right w:val="single" w:sz="4" w:space="0" w:color="AEC6D8"/>
+            </w:tcBorders>
+            <w:shd w:val="clear" w:color="auto" w:fill="EBF3FA"/>
+            <w:tcMar>
+              <w:top w:w="70" w:type="dxa"/>
+              <w:left w:w="140" w:type="dxa"/>
+              <w:bottom w:w="70" w:type="dxa"/>
+              <w:right w:w="140" w:type="dxa"/>
+            </w:tcMar>
+            <w:vAlign w:val="center"/>
+          </w:tcPr>
+          <w:p>
+            <w:r>
+              <w:rPr>
+                <w:sz w:val="19"/>
+                <w:szCs w:val="19"/>
+              </w:rPr>
+              <w:t xml:space="preserve">Sugestão da IA</w:t>
+            </w:r>
+          </w:p>
+        </w:tc>
+      </w:tr>
+      <w:tr>
+        <w:tblPrEx>
+          <w:tblCellMar>
+            <w:top w:w="0" w:type="dxa"/>
+            <w:bottom w:w="0" w:type="dxa"/>
+          </w:tblCellMar>
+        </w:tblPrEx>
+        <w:tc>
+          <w:tcPr>
+            <w:tcW w:w="2600" w:type="dxa"/>
+            <w:tcBorders>
+              <w:top w:val="single" w:sz="4" w:space="0" w:color="AEC6D8"/>
+              <w:left w:val="single" w:sz="4" w:space="0" w:color="AEC6D8"/>
+              <w:bottom w:val="single" w:sz="4" w:space="0" w:color="AEC6D8"/>
+              <w:right w:val="single" w:sz="4" w:space="0" w:color="AEC6D8"/>
+            </w:tcBorders>
+            <w:shd w:val="clear" w:color="auto" w:fill="FFFFFF"/>
+            <w:tcMar>
+              <w:top w:w="70" w:type="dxa"/>
+              <w:left w:w="140" w:type="dxa"/>
+              <w:bottom w:w="70" w:type="dxa"/>
+              <w:right w:w="140" w:type="dxa"/>
+            </w:tcMar>
+            <w:vAlign w:val="center"/>
+          </w:tcPr>
+          <w:p>
+            <w:r>
+              <w:rPr>
+                <w:sz w:val="19"/>
+                <w:szCs w:val="19"/>
+              </w:rPr>
+              <w:t xml:space="preserve">prioritization_decisions.reason / confidence</w:t>
+            </w:r>
+          </w:p>
+        </w:tc>
+        <w:tc>
+          <w:tcPr>
+            <w:tcW w:w="2200" w:type="dxa"/>
+            <w:tcBorders>
+              <w:top w:val="single" w:sz="4" w:space="0" w:color="AEC6D8"/>
+              <w:left w:val="single" w:sz="4" w:space="0" w:color="AEC6D8"/>
+              <w:bottom w:val="single" w:sz="4" w:space="0" w:color="AEC6D8"/>
+              <w:right w:val="single" w:sz="4" w:space="0" w:color="AEC6D8"/>
+            </w:tcBorders>
+            <w:shd w:val="clear" w:color="auto" w:fill="FFFFFF"/>
+            <w:tcMar>
+              <w:top w:w="70" w:type="dxa"/>
+              <w:left w:w="140" w:type="dxa"/>
+              <w:bottom w:w="70" w:type="dxa"/>
+              <w:right w:w="140" w:type="dxa"/>
+            </w:tcMar>
+            <w:vAlign w:val="center"/>
+          </w:tcPr>
+          <w:p>
+            <w:r>
+              <w:rPr>
+                <w:sz w:val="19"/>
+                <w:szCs w:val="19"/>
+              </w:rPr>
+              <w:t xml:space="preserve">text / float</w:t>
+            </w:r>
+          </w:p>
+        </w:tc>
+        <w:tc>
+          <w:tcPr>
+            <w:tcW w:w="4560" w:type="dxa"/>
+            <w:tcBorders>
+              <w:top w:val="single" w:sz="4" w:space="0" w:color="AEC6D8"/>
+              <w:left w:val="single" w:sz="4" w:space="0" w:color="AEC6D8"/>
+              <w:bottom w:val="single" w:sz="4" w:space="0" w:color="AEC6D8"/>
+              <w:right w:val="single" w:sz="4" w:space="0" w:color="AEC6D8"/>
+            </w:tcBorders>
+            <w:shd w:val="clear" w:color="auto" w:fill="FFFFFF"/>
+            <w:tcMar>
+              <w:top w:w="70" w:type="dxa"/>
+              <w:left w:w="140" w:type="dxa"/>
+              <w:bottom w:w="70" w:type="dxa"/>
+              <w:right w:w="140" w:type="dxa"/>
+            </w:tcMar>
+            <w:vAlign w:val="center"/>
+          </w:tcPr>
+          <w:p>
+            <w:r>
+              <w:rPr>
+                <w:sz w:val="19"/>
+                <w:szCs w:val="19"/>
+              </w:rPr>
+              <w:t xml:space="preserve">Justificativa e confiança da IA</w:t>
+            </w:r>
+          </w:p>
+        </w:tc>
+      </w:tr>
+      <w:tr>
+        <w:tblPrEx>
+          <w:tblCellMar>
+            <w:top w:w="0" w:type="dxa"/>
+            <w:bottom w:w="0" w:type="dxa"/>
+          </w:tblCellMar>
+        </w:tblPrEx>
+        <w:tc>
+          <w:tcPr>
+            <w:tcW w:w="2600" w:type="dxa"/>
+            <w:tcBorders>
+              <w:top w:val="single" w:sz="4" w:space="0" w:color="AEC6D8"/>
+              <w:left w:val="single" w:sz="4" w:space="0" w:color="AEC6D8"/>
+              <w:bottom w:val="single" w:sz="4" w:space="0" w:color="AEC6D8"/>
+              <w:right w:val="single" w:sz="4" w:space="0" w:color="AEC6D8"/>
+            </w:tcBorders>
+            <w:shd w:val="clear" w:color="auto" w:fill="EBF3FA"/>
+            <w:tcMar>
+              <w:top w:w="70" w:type="dxa"/>
+              <w:left w:w="140" w:type="dxa"/>
+              <w:bottom w:w="70" w:type="dxa"/>
+              <w:right w:w="140" w:type="dxa"/>
+            </w:tcMar>
+            <w:vAlign w:val="center"/>
+          </w:tcPr>
+          <w:p>
+            <w:r>
+              <w:rPr>
+                <w:sz w:val="19"/>
+                <w:szCs w:val="19"/>
+              </w:rPr>
+              <w:t xml:space="preserve">prioritization_decisions.action</w:t>
+            </w:r>
+          </w:p>
+        </w:tc>
+        <w:tc>
+          <w:tcPr>
+            <w:tcW w:w="2200" w:type="dxa"/>
+            <w:tcBorders>
+              <w:top w:val="single" w:sz="4" w:space="0" w:color="AEC6D8"/>
+              <w:left w:val="single" w:sz="4" w:space="0" w:color="AEC6D8"/>
+              <w:bottom w:val="single" w:sz="4" w:space="0" w:color="AEC6D8"/>
+              <w:right w:val="single" w:sz="4" w:space="0" w:color="AEC6D8"/>
+            </w:tcBorders>
+            <w:shd w:val="clear" w:color="auto" w:fill="EBF3FA"/>
+            <w:tcMar>
+              <w:top w:w="70" w:type="dxa"/>
+              <w:left w:w="140" w:type="dxa"/>
+              <w:bottom w:w="70" w:type="dxa"/>
+              <w:right w:w="140" w:type="dxa"/>
+            </w:tcMar>
+            <w:vAlign w:val="center"/>
+          </w:tcPr>
+          <w:p>
+            <w:r>
+              <w:rPr>
+                <w:sz w:val="19"/>
+                <w:szCs w:val="19"/>
+              </w:rPr>
+              <w:t xml:space="preserve">enum</w:t>
+            </w:r>
+          </w:p>
+        </w:tc>
+        <w:tc>
+          <w:tcPr>
+            <w:tcW w:w="4560" w:type="dxa"/>
+            <w:tcBorders>
+              <w:top w:val="single" w:sz="4" w:space="0" w:color="AEC6D8"/>
+              <w:left w:val="single" w:sz="4" w:space="0" w:color="AEC6D8"/>
+              <w:bottom w:val="single" w:sz="4" w:space="0" w:color="AEC6D8"/>
+              <w:right w:val="single" w:sz="4" w:space="0" w:color="AEC6D8"/>
+            </w:tcBorders>
+            <w:shd w:val="clear" w:color="auto" w:fill="EBF3FA"/>
+            <w:tcMar>
+              <w:top w:w="70" w:type="dxa"/>
+              <w:left w:w="140" w:type="dxa"/>
+              <w:bottom w:w="70" w:type="dxa"/>
+              <w:right w:w="140" w:type="dxa"/>
+            </w:tcMar>
+            <w:vAlign w:val="center"/>
+          </w:tcPr>
+          <w:p>
+            <w:r>
+              <w:rPr>
+                <w:sz w:val="19"/>
+                <w:szCs w:val="19"/>
+              </w:rPr>
+              <w:t xml:space="preserve">accepted / rejected / urgent</w:t>
+            </w:r>
+          </w:p>
+        </w:tc>
+      </w:tr>
+      <w:tr>
+        <w:tblPrEx>
+          <w:tblCellMar>
+            <w:top w:w="0" w:type="dxa"/>
+            <w:bottom w:w="0" w:type="dxa"/>
+          </w:tblCellMar>
+        </w:tblPrEx>
+        <w:tc>
+          <w:tcPr>
+            <w:tcW w:w="2600" w:type="dxa"/>
+            <w:tcBorders>
+              <w:top w:val="single" w:sz="4" w:space="0" w:color="AEC6D8"/>
+              <w:left w:val="single" w:sz="4" w:space="0" w:color="AEC6D8"/>
+              <w:bottom w:val="single" w:sz="4" w:space="0" w:color="AEC6D8"/>
+              <w:right w:val="single" w:sz="4" w:space="0" w:color="AEC6D8"/>
+            </w:tcBorders>
+            <w:shd w:val="clear" w:color="auto" w:fill="FFFFFF"/>
+            <w:tcMar>
+              <w:top w:w="70" w:type="dxa"/>
+              <w:left w:w="140" w:type="dxa"/>
+              <w:bottom w:w="70" w:type="dxa"/>
+              <w:right w:w="140" w:type="dxa"/>
+            </w:tcMar>
+            <w:vAlign w:val="center"/>
+          </w:tcPr>
+          <w:p>
+            <w:r>
+              <w:rPr>
+                <w:sz w:val="19"/>
+                <w:szCs w:val="19"/>
+              </w:rPr>
+              <w:t xml:space="preserve">prioritization_decisions.final_quadrant</w:t>
+            </w:r>
+          </w:p>
+        </w:tc>
+        <w:tc>
+          <w:tcPr>
+            <w:tcW w:w="2200" w:type="dxa"/>
+            <w:tcBorders>
+              <w:top w:val="single" w:sz="4" w:space="0" w:color="AEC6D8"/>
+              <w:left w:val="single" w:sz="4" w:space="0" w:color="AEC6D8"/>
+              <w:bottom w:val="single" w:sz="4" w:space="0" w:color="AEC6D8"/>
+              <w:right w:val="single" w:sz="4" w:space="0" w:color="AEC6D8"/>
+            </w:tcBorders>
+            <w:shd w:val="clear" w:color="auto" w:fill="FFFFFF"/>
+            <w:tcMar>
+              <w:top w:w="70" w:type="dxa"/>
+              <w:left w:w="140" w:type="dxa"/>
+              <w:bottom w:w="70" w:type="dxa"/>
+              <w:right w:w="140" w:type="dxa"/>
+            </w:tcMar>
+            <w:vAlign w:val="center"/>
+          </w:tcPr>
+          <w:p>
+            <w:r>
+              <w:rPr>
+                <w:sz w:val="19"/>
+                <w:szCs w:val="19"/>
+              </w:rPr>
+              <w:t xml:space="preserve">enum</w:t>
+            </w:r>
+          </w:p>
+        </w:tc>
+        <w:tc>
+          <w:tcPr>
+            <w:tcW w:w="4560" w:type="dxa"/>
+            <w:tcBorders>
+              <w:top w:val="single" w:sz="4" w:space="0" w:color="AEC6D8"/>
+              <w:left w:val="single" w:sz="4" w:space="0" w:color="AEC6D8"/>
+              <w:bottom w:val="single" w:sz="4" w:space="0" w:color="AEC6D8"/>
+              <w:right w:val="single" w:sz="4" w:space="0" w:color="AEC6D8"/>
+            </w:tcBorders>
+            <w:shd w:val="clear" w:color="auto" w:fill="FFFFFF"/>
+            <w:tcMar>
+              <w:top w:w="70" w:type="dxa"/>
+              <w:left w:w="140" w:type="dxa"/>
+              <w:bottom w:w="70" w:type="dxa"/>
+              <w:right w:w="140" w:type="dxa"/>
+            </w:tcMar>
+            <w:vAlign w:val="center"/>
+          </w:tcPr>
+          <w:p>
+            <w:r>
+              <w:rPr>
+                <w:sz w:val="19"/>
+                <w:szCs w:val="19"/>
+              </w:rPr>
+              <w:t xml:space="preserve">Quadrante escolhido pelo usuário</w:t>
+            </w:r>
+          </w:p>
+        </w:tc>
+      </w:tr>
+      <w:tr>
+        <w:tblPrEx>
+          <w:tblCellMar>
+            <w:top w:w="0" w:type="dxa"/>
+            <w:bottom w:w="0" w:type="dxa"/>
+          </w:tblCellMar>
+        </w:tblPrEx>
+        <w:tc>
+          <w:tcPr>
+            <w:tcW w:w="2600" w:type="dxa"/>
+            <w:tcBorders>
+              <w:top w:val="single" w:sz="4" w:space="0" w:color="AEC6D8"/>
+              <w:left w:val="single" w:sz="4" w:space="0" w:color="AEC6D8"/>
+              <w:bottom w:val="single" w:sz="4" w:space="0" w:color="AEC6D8"/>
+              <w:right w:val="single" w:sz="4" w:space="0" w:color="AEC6D8"/>
+            </w:tcBorders>
+            <w:shd w:val="clear" w:color="auto" w:fill="EBF3FA"/>
+            <w:tcMar>
+              <w:top w:w="70" w:type="dxa"/>
+              <w:left w:w="140" w:type="dxa"/>
+              <w:bottom w:w="70" w:type="dxa"/>
+              <w:right w:w="140" w:type="dxa"/>
+            </w:tcMar>
+            <w:vAlign w:val="center"/>
+          </w:tcPr>
+          <w:p>
+            <w:r>
+              <w:rPr>
+                <w:sz w:val="19"/>
+                <w:szCs w:val="19"/>
+              </w:rPr>
+              <w:t xml:space="preserve">prioritization_decisions.decided_at</w:t>
+            </w:r>
+          </w:p>
+        </w:tc>
+        <w:tc>
+          <w:tcPr>
+            <w:tcW w:w="2200" w:type="dxa"/>
+            <w:tcBorders>
+              <w:top w:val="single" w:sz="4" w:space="0" w:color="AEC6D8"/>
+              <w:left w:val="single" w:sz="4" w:space="0" w:color="AEC6D8"/>
+              <w:bottom w:val="single" w:sz="4" w:space="0" w:color="AEC6D8"/>
+              <w:right w:val="single" w:sz="4" w:space="0" w:color="AEC6D8"/>
+            </w:tcBorders>
+            <w:shd w:val="clear" w:color="auto" w:fill="EBF3FA"/>
+            <w:tcMar>
+              <w:top w:w="70" w:type="dxa"/>
+              <w:left w:w="140" w:type="dxa"/>
+              <w:bottom w:w="70" w:type="dxa"/>
+              <w:right w:w="140" w:type="dxa"/>
+            </w:tcMar>
+            <w:vAlign w:val="center"/>
+          </w:tcPr>
+          <w:p>
+            <w:r>
+              <w:rPr>
+                <w:sz w:val="19"/>
+                <w:szCs w:val="19"/>
+              </w:rPr>
+              <w:t xml:space="preserve">timestamp</w:t>
+            </w:r>
+          </w:p>
+        </w:tc>
+        <w:tc>
+          <w:tcPr>
+            <w:tcW w:w="4560" w:type="dxa"/>
+            <w:tcBorders>
+              <w:top w:val="single" w:sz="4" w:space="0" w:color="AEC6D8"/>
+              <w:left w:val="single" w:sz="4" w:space="0" w:color="AEC6D8"/>
+              <w:bottom w:val="single" w:sz="4" w:space="0" w:color="AEC6D8"/>
+              <w:right w:val="single" w:sz="4" w:space="0" w:color="AEC6D8"/>
+            </w:tcBorders>
+            <w:shd w:val="clear" w:color="auto" w:fill="EBF3FA"/>
+            <w:tcMar>
+              <w:top w:w="70" w:type="dxa"/>
+              <w:left w:w="140" w:type="dxa"/>
+              <w:bottom w:w="70" w:type="dxa"/>
+              <w:right w:w="140" w:type="dxa"/>
+            </w:tcMar>
+            <w:vAlign w:val="center"/>
+          </w:tcPr>
+          <w:p>
+            <w:r>
+              <w:rPr>
+                <w:sz w:val="19"/>
+                <w:szCs w:val="19"/>
+              </w:rPr>
+              <w:t xml:space="preserve">Momento da decisão (histórico usado pela IA — RF-37)</w:t>
             </w:r>
           </w:p>
         </w:tc>
@@ -17605,6 +21359,98 @@
           </w:p>
         </w:tc>
       </w:tr>
+      <w:tr>
+        <w:tblPrEx>
+          <w:tblCellMar>
+            <w:top w:w="0" w:type="dxa"/>
+            <w:bottom w:w="0" w:type="dxa"/>
+          </w:tblCellMar>
+        </w:tblPrEx>
+        <w:tc>
+          <w:tcPr>
+            <w:tcW w:w="2800" w:type="dxa"/>
+            <w:tcBorders>
+              <w:top w:val="single" w:sz="4" w:space="0" w:color="AEC6D8"/>
+              <w:left w:val="single" w:sz="4" w:space="0" w:color="AEC6D8"/>
+              <w:bottom w:val="single" w:sz="4" w:space="0" w:color="AEC6D8"/>
+              <w:right w:val="single" w:sz="4" w:space="0" w:color="AEC6D8"/>
+            </w:tcBorders>
+            <w:shd w:val="clear" w:color="auto" w:fill="FFFFFF"/>
+            <w:tcMar>
+              <w:top w:w="70" w:type="dxa"/>
+              <w:left w:w="140" w:type="dxa"/>
+              <w:bottom w:w="70" w:type="dxa"/>
+              <w:right w:w="140" w:type="dxa"/>
+            </w:tcMar>
+            <w:vAlign w:val="center"/>
+          </w:tcPr>
+          <w:p>
+            <w:r>
+              <w:rPr>
+                <w:sz w:val="19"/>
+                <w:szCs w:val="19"/>
+              </w:rPr>
+              <w:t xml:space="preserve">Priorização com IA</w:t>
+            </w:r>
+          </w:p>
+        </w:tc>
+        <w:tc>
+          <w:tcPr>
+            <w:tcW w:w="1400" w:type="dxa"/>
+            <w:tcBorders>
+              <w:top w:val="single" w:sz="4" w:space="0" w:color="AEC6D8"/>
+              <w:left w:val="single" w:sz="4" w:space="0" w:color="AEC6D8"/>
+              <w:bottom w:val="single" w:sz="4" w:space="0" w:color="AEC6D8"/>
+              <w:right w:val="single" w:sz="4" w:space="0" w:color="AEC6D8"/>
+            </w:tcBorders>
+            <w:shd w:val="clear" w:color="auto" w:fill="FFFFFF"/>
+            <w:tcMar>
+              <w:top w:w="70" w:type="dxa"/>
+              <w:left w:w="140" w:type="dxa"/>
+              <w:bottom w:w="70" w:type="dxa"/>
+              <w:right w:w="140" w:type="dxa"/>
+            </w:tcMar>
+            <w:vAlign w:val="center"/>
+          </w:tcPr>
+          <w:p>
+            <w:r>
+              <w:rPr>
+                <w:sz w:val="19"/>
+                <w:szCs w:val="19"/>
+              </w:rPr>
+              <w:t xml:space="preserve">Pendente</w:t>
+            </w:r>
+          </w:p>
+        </w:tc>
+        <w:tc>
+          <w:tcPr>
+            <w:tcW w:w="5160" w:type="dxa"/>
+            <w:tcBorders>
+              <w:top w:val="single" w:sz="4" w:space="0" w:color="AEC6D8"/>
+              <w:left w:val="single" w:sz="4" w:space="0" w:color="AEC6D8"/>
+              <w:bottom w:val="single" w:sz="4" w:space="0" w:color="AEC6D8"/>
+              <w:right w:val="single" w:sz="4" w:space="0" w:color="AEC6D8"/>
+            </w:tcBorders>
+            <w:shd w:val="clear" w:color="auto" w:fill="FFFFFF"/>
+            <w:tcMar>
+              <w:top w:w="70" w:type="dxa"/>
+              <w:left w:w="140" w:type="dxa"/>
+              <w:bottom w:w="70" w:type="dxa"/>
+              <w:right w:w="140" w:type="dxa"/>
+            </w:tcMar>
+            <w:vAlign w:val="center"/>
+          </w:tcPr>
+          <w:p>
+            <w:r>
+              <w:rPr>
+                <w:sz w:val="19"/>
+                <w:szCs w:val="19"/>
+              </w:rPr>
+              <w:t xml:space="preserve">Feature nova (v2.1). Sem protótipo; a IA própria será implementada atrás da porta TaskPrioritizer.</w:t>
+            </w:r>
+          </w:p>
+        </w:tc>
+      </w:tr>
     </w:tbl>
     <w:p>
       <w:pPr>
@@ -18571,6 +22417,98 @@
                 <w:szCs w:val="19"/>
               </w:rPr>
               <w:t xml:space="preserve">Total de Pomodoros na semana e gráfico semanal (Victory Native).</w:t>
+            </w:r>
+          </w:p>
+        </w:tc>
+      </w:tr>
+      <w:tr>
+        <w:tblPrEx>
+          <w:tblCellMar>
+            <w:top w:w="0" w:type="dxa"/>
+            <w:bottom w:w="0" w:type="dxa"/>
+          </w:tblCellMar>
+        </w:tblPrEx>
+        <w:tc>
+          <w:tcPr>
+            <w:tcW w:w="2800" w:type="dxa"/>
+            <w:tcBorders>
+              <w:top w:val="single" w:sz="4" w:space="0" w:color="AEC6D8"/>
+              <w:left w:val="single" w:sz="4" w:space="0" w:color="AEC6D8"/>
+              <w:bottom w:val="single" w:sz="4" w:space="0" w:color="AEC6D8"/>
+              <w:right w:val="single" w:sz="4" w:space="0" w:color="AEC6D8"/>
+            </w:tcBorders>
+            <w:shd w:val="clear" w:color="auto" w:fill="FFFFFF"/>
+            <w:tcMar>
+              <w:top w:w="70" w:type="dxa"/>
+              <w:left w:w="140" w:type="dxa"/>
+              <w:bottom w:w="70" w:type="dxa"/>
+              <w:right w:w="140" w:type="dxa"/>
+            </w:tcMar>
+            <w:vAlign w:val="center"/>
+          </w:tcPr>
+          <w:p>
+            <w:r>
+              <w:rPr>
+                <w:sz w:val="19"/>
+                <w:szCs w:val="19"/>
+              </w:rPr>
+              <w:t xml:space="preserve">Priorização com IA (cards + matriz)</w:t>
+            </w:r>
+          </w:p>
+        </w:tc>
+        <w:tc>
+          <w:tcPr>
+            <w:tcW w:w="1400" w:type="dxa"/>
+            <w:tcBorders>
+              <w:top w:val="single" w:sz="4" w:space="0" w:color="AEC6D8"/>
+              <w:left w:val="single" w:sz="4" w:space="0" w:color="AEC6D8"/>
+              <w:bottom w:val="single" w:sz="4" w:space="0" w:color="AEC6D8"/>
+              <w:right w:val="single" w:sz="4" w:space="0" w:color="AEC6D8"/>
+            </w:tcBorders>
+            <w:shd w:val="clear" w:color="auto" w:fill="FFFFFF"/>
+            <w:tcMar>
+              <w:top w:w="70" w:type="dxa"/>
+              <w:left w:w="140" w:type="dxa"/>
+              <w:bottom w:w="70" w:type="dxa"/>
+              <w:right w:w="140" w:type="dxa"/>
+            </w:tcMar>
+            <w:vAlign w:val="center"/>
+          </w:tcPr>
+          <w:p>
+            <w:r>
+              <w:rPr>
+                <w:sz w:val="19"/>
+                <w:szCs w:val="19"/>
+              </w:rPr>
+              <w:t xml:space="preserve">Falta (sem protótipo)</w:t>
+            </w:r>
+          </w:p>
+        </w:tc>
+        <w:tc>
+          <w:tcPr>
+            <w:tcW w:w="5160" w:type="dxa"/>
+            <w:tcBorders>
+              <w:top w:val="single" w:sz="4" w:space="0" w:color="AEC6D8"/>
+              <w:left w:val="single" w:sz="4" w:space="0" w:color="AEC6D8"/>
+              <w:bottom w:val="single" w:sz="4" w:space="0" w:color="AEC6D8"/>
+              <w:right w:val="single" w:sz="4" w:space="0" w:color="AEC6D8"/>
+            </w:tcBorders>
+            <w:shd w:val="clear" w:color="auto" w:fill="FFFFFF"/>
+            <w:tcMar>
+              <w:top w:w="70" w:type="dxa"/>
+              <w:left w:w="140" w:type="dxa"/>
+              <w:bottom w:w="70" w:type="dxa"/>
+              <w:right w:w="140" w:type="dxa"/>
+            </w:tcMar>
+            <w:vAlign w:val="center"/>
+          </w:tcPr>
+          <w:p>
+            <w:r>
+              <w:rPr>
+                <w:sz w:val="19"/>
+                <w:szCs w:val="19"/>
+              </w:rPr>
+              <w:t xml:space="preserve">Todo o fluxo da seção 5.10: entrada na Home, aviso de privacidade, cards com swipe, seletor de quadrante, matriz 2×2 e estados offline/erro.</w:t>
             </w:r>
           </w:p>
         </w:tc>
@@ -21453,7 +25391,7 @@
                 <w:sz w:val="19"/>
                 <w:szCs w:val="19"/>
               </w:rPr>
-              <w:t xml:space="preserve">Documento de Visão v2.0</w:t>
+              <w:t xml:space="preserve">Documento de Visão v2.1</w:t>
             </w:r>
           </w:p>
         </w:tc>
@@ -21517,7 +25455,7 @@
                 <w:sz w:val="19"/>
                 <w:szCs w:val="19"/>
               </w:rPr>
-              <w:t xml:space="preserve">Documento de Requisitos v2.0</w:t>
+              <w:t xml:space="preserve">Documento de Requisitos v2.1</w:t>
             </w:r>
           </w:p>
         </w:tc>
@@ -22081,7 +26019,7 @@
           <w:sz w:val="16"/>
           <w:szCs w:val="16"/>
         </w:rPr>
-        <w:t xml:space="preserve">TaskFlow  ·  Documento de Arquitetura v2.0  ·  Setembro 2026  ·  Micael, Murilo, Paulo, Pedro B., Pedro T., Vinícius O. e Vinicius R.</w:t>
+        <w:t xml:space="preserve">TaskFlow  ·  Documento de Arquitetura v2.1  ·  Setembro 2026  ·  Micael, Murilo, Paulo, Pedro B., Pedro T., Vinícius O. e Vinicius R.</w:t>
       </w:r>
     </w:p>
     <w:sectPr>
@@ -22161,7 +26099,7 @@
         <w:sz w:val="16"/>
         <w:szCs w:val="16"/>
       </w:rPr>
-      <w:t>v2.0  ·</w:t>
+      <w:t>v2.1  ·</w:t>
     </w:r>
     <w:proofErr w:type="gramEnd"/>
     <w:r>

</xml_diff>